<commit_message>
docs: actualizar Diseño y Arquitectura
</commit_message>
<xml_diff>
--- a/Documentación/Diseño y Arquitectura.docx
+++ b/Documentación/Diseño y Arquitectura.docx
@@ -24,12 +24,12 @@
             <wp:extent cx="3104515" cy="695325"/>
             <wp:effectExtent b="0" l="0" r="0" t="0"/>
             <wp:wrapSquare wrapText="bothSides" distB="0" distT="0" distL="114300" distR="114300"/>
-            <wp:docPr descr="Descripción: logo.jpg" id="2" name="image3.jpg"/>
+            <wp:docPr descr="Descripción: logo.jpg" id="21" name="image19.jpg"/>
             <a:graphic>
               <a:graphicData uri="http://schemas.openxmlformats.org/drawingml/2006/picture">
                 <pic:pic>
                   <pic:nvPicPr>
-                    <pic:cNvPr descr="Descripción: logo.jpg" id="0" name="image3.jpg"/>
+                    <pic:cNvPr descr="Descripción: logo.jpg" id="0" name="image19.jpg"/>
                     <pic:cNvPicPr preferRelativeResize="0"/>
                   </pic:nvPicPr>
                   <pic:blipFill>
@@ -647,6 +647,3507 @@
           <w:u w:val="single"/>
           <w:rtl w:val="0"/>
         </w:rPr>
+        <w:t xml:space="preserve">Modelo-Entidad-Relación</w:t>
+      </w:r>
+    </w:p>
+    <w:p>
+      <w:pPr>
+        <w:rPr>
+          <w:b w:val="1"/>
+          <w:bCs w:val="1"/>
+          <w:u w:val="single"/>
+        </w:rPr>
+      </w:pPr>
+      <w:r>
+        <w:rPr>
+          <w:rtl w:val="0"/>
+        </w:rPr>
+      </w:r>
+    </w:p>
+    <w:p>
+      <w:pPr>
+        <w:rPr>
+          <w:b w:val="1"/>
+          <w:bCs w:val="1"/>
+          <w:u w:val="single"/>
+        </w:rPr>
+      </w:pPr>
+      <w:r>
+        <w:rPr>
+          <w:b w:val="1"/>
+          <w:bCs w:val="1"/>
+          <w:u w:val="single"/>
+        </w:rPr>
+        <w:drawing>
+          <wp:inline distB="114300" distT="114300" distL="114300" distR="114300">
+            <wp:extent cx="5731200" cy="3962400"/>
+            <wp:effectExtent b="0" l="0" r="0" t="0"/>
+            <wp:docPr id="19" name="image13.png"/>
+            <a:graphic>
+              <a:graphicData uri="http://schemas.openxmlformats.org/drawingml/2006/picture">
+                <pic:pic>
+                  <pic:nvPicPr>
+                    <pic:cNvPr id="0" name="image13.png"/>
+                    <pic:cNvPicPr preferRelativeResize="0"/>
+                  </pic:nvPicPr>
+                  <pic:blipFill>
+                    <a:blip r:embed="rId7"/>
+                    <a:srcRect b="0" l="0" r="0" t="0"/>
+                    <a:stretch>
+                      <a:fillRect/>
+                    </a:stretch>
+                  </pic:blipFill>
+                  <pic:spPr>
+                    <a:xfrm>
+                      <a:off x="0" y="0"/>
+                      <a:ext cx="5731200" cy="3962400"/>
+                    </a:xfrm>
+                    <a:prstGeom prst="rect"/>
+                    <a:ln/>
+                  </pic:spPr>
+                </pic:pic>
+              </a:graphicData>
+            </a:graphic>
+          </wp:inline>
+        </w:drawing>
+      </w:r>
+      <w:r>
+        <w:rPr>
+          <w:rtl w:val="0"/>
+        </w:rPr>
+      </w:r>
+    </w:p>
+    <w:p>
+      <w:pPr>
+        <w:rPr>
+          <w:b w:val="1"/>
+          <w:bCs w:val="1"/>
+          <w:u w:val="single"/>
+        </w:rPr>
+      </w:pPr>
+      <w:r>
+        <w:rPr>
+          <w:rtl w:val="0"/>
+        </w:rPr>
+      </w:r>
+    </w:p>
+    <w:p>
+      <w:pPr>
+        <w:rPr>
+          <w:b w:val="1"/>
+          <w:bCs w:val="1"/>
+          <w:u w:val="single"/>
+        </w:rPr>
+      </w:pPr>
+      <w:r>
+        <w:rPr>
+          <w:rtl w:val="0"/>
+        </w:rPr>
+      </w:r>
+    </w:p>
+    <w:p>
+      <w:pPr>
+        <w:rPr>
+          <w:b w:val="1"/>
+          <w:bCs w:val="1"/>
+          <w:u w:val="single"/>
+        </w:rPr>
+      </w:pPr>
+      <w:r>
+        <w:rPr>
+          <w:rtl w:val="0"/>
+        </w:rPr>
+      </w:r>
+    </w:p>
+    <w:p>
+      <w:pPr>
+        <w:rPr>
+          <w:b w:val="1"/>
+          <w:bCs w:val="1"/>
+          <w:u w:val="single"/>
+        </w:rPr>
+      </w:pPr>
+      <w:r>
+        <w:rPr>
+          <w:rtl w:val="0"/>
+        </w:rPr>
+      </w:r>
+    </w:p>
+    <w:p>
+      <w:pPr>
+        <w:rPr>
+          <w:b w:val="1"/>
+          <w:bCs w:val="1"/>
+          <w:u w:val="single"/>
+        </w:rPr>
+      </w:pPr>
+      <w:r>
+        <w:rPr>
+          <w:rtl w:val="0"/>
+        </w:rPr>
+      </w:r>
+    </w:p>
+    <w:p>
+      <w:pPr>
+        <w:rPr>
+          <w:b w:val="1"/>
+          <w:bCs w:val="1"/>
+          <w:u w:val="single"/>
+        </w:rPr>
+      </w:pPr>
+      <w:r>
+        <w:rPr>
+          <w:rtl w:val="0"/>
+        </w:rPr>
+      </w:r>
+    </w:p>
+    <w:p>
+      <w:pPr>
+        <w:rPr>
+          <w:b w:val="1"/>
+          <w:bCs w:val="1"/>
+          <w:u w:val="single"/>
+        </w:rPr>
+      </w:pPr>
+      <w:r>
+        <w:rPr>
+          <w:rtl w:val="0"/>
+        </w:rPr>
+      </w:r>
+    </w:p>
+    <w:p>
+      <w:pPr>
+        <w:rPr>
+          <w:b w:val="1"/>
+          <w:bCs w:val="1"/>
+          <w:u w:val="single"/>
+        </w:rPr>
+      </w:pPr>
+      <w:r>
+        <w:rPr>
+          <w:rtl w:val="0"/>
+        </w:rPr>
+      </w:r>
+    </w:p>
+    <w:p>
+      <w:pPr>
+        <w:rPr>
+          <w:b w:val="1"/>
+          <w:bCs w:val="1"/>
+          <w:u w:val="single"/>
+        </w:rPr>
+      </w:pPr>
+      <w:r>
+        <w:rPr>
+          <w:rtl w:val="0"/>
+        </w:rPr>
+      </w:r>
+    </w:p>
+    <w:p>
+      <w:pPr>
+        <w:rPr>
+          <w:b w:val="1"/>
+          <w:bCs w:val="1"/>
+          <w:u w:val="single"/>
+        </w:rPr>
+      </w:pPr>
+      <w:r>
+        <w:rPr>
+          <w:rtl w:val="0"/>
+        </w:rPr>
+      </w:r>
+    </w:p>
+    <w:p>
+      <w:pPr>
+        <w:rPr>
+          <w:b w:val="1"/>
+          <w:bCs w:val="1"/>
+          <w:u w:val="single"/>
+        </w:rPr>
+      </w:pPr>
+      <w:r>
+        <w:rPr>
+          <w:rtl w:val="0"/>
+        </w:rPr>
+      </w:r>
+    </w:p>
+    <w:p>
+      <w:pPr>
+        <w:rPr>
+          <w:b w:val="1"/>
+          <w:bCs w:val="1"/>
+          <w:u w:val="single"/>
+        </w:rPr>
+      </w:pPr>
+      <w:r>
+        <w:rPr>
+          <w:rtl w:val="0"/>
+        </w:rPr>
+      </w:r>
+    </w:p>
+    <w:p>
+      <w:pPr>
+        <w:rPr>
+          <w:b w:val="1"/>
+          <w:bCs w:val="1"/>
+          <w:u w:val="single"/>
+        </w:rPr>
+      </w:pPr>
+      <w:r>
+        <w:rPr>
+          <w:rtl w:val="0"/>
+        </w:rPr>
+      </w:r>
+    </w:p>
+    <w:p>
+      <w:pPr>
+        <w:rPr>
+          <w:b w:val="1"/>
+          <w:bCs w:val="1"/>
+          <w:u w:val="single"/>
+        </w:rPr>
+      </w:pPr>
+      <w:r>
+        <w:rPr>
+          <w:rtl w:val="0"/>
+        </w:rPr>
+      </w:r>
+    </w:p>
+    <w:p>
+      <w:pPr>
+        <w:rPr>
+          <w:b w:val="1"/>
+          <w:bCs w:val="1"/>
+          <w:u w:val="single"/>
+        </w:rPr>
+      </w:pPr>
+      <w:r>
+        <w:rPr>
+          <w:rtl w:val="0"/>
+        </w:rPr>
+      </w:r>
+    </w:p>
+    <w:p>
+      <w:pPr>
+        <w:rPr>
+          <w:b w:val="1"/>
+          <w:bCs w:val="1"/>
+          <w:u w:val="single"/>
+        </w:rPr>
+      </w:pPr>
+      <w:r>
+        <w:rPr>
+          <w:rtl w:val="0"/>
+        </w:rPr>
+      </w:r>
+    </w:p>
+    <w:p>
+      <w:pPr>
+        <w:rPr>
+          <w:b w:val="1"/>
+          <w:bCs w:val="1"/>
+          <w:u w:val="single"/>
+        </w:rPr>
+      </w:pPr>
+      <w:r>
+        <w:rPr>
+          <w:rtl w:val="0"/>
+        </w:rPr>
+      </w:r>
+    </w:p>
+    <w:p>
+      <w:pPr>
+        <w:rPr>
+          <w:b w:val="1"/>
+          <w:bCs w:val="1"/>
+          <w:u w:val="single"/>
+        </w:rPr>
+      </w:pPr>
+      <w:r>
+        <w:rPr>
+          <w:rtl w:val="0"/>
+        </w:rPr>
+      </w:r>
+    </w:p>
+    <w:p>
+      <w:pPr>
+        <w:rPr>
+          <w:b w:val="1"/>
+          <w:bCs w:val="1"/>
+          <w:u w:val="single"/>
+        </w:rPr>
+      </w:pPr>
+      <w:r>
+        <w:rPr>
+          <w:rtl w:val="0"/>
+        </w:rPr>
+      </w:r>
+    </w:p>
+    <w:p>
+      <w:pPr>
+        <w:rPr>
+          <w:b w:val="1"/>
+          <w:bCs w:val="1"/>
+          <w:u w:val="single"/>
+        </w:rPr>
+      </w:pPr>
+      <w:r>
+        <w:rPr>
+          <w:rtl w:val="0"/>
+        </w:rPr>
+      </w:r>
+    </w:p>
+    <w:p>
+      <w:pPr>
+        <w:rPr>
+          <w:b w:val="1"/>
+          <w:bCs w:val="1"/>
+          <w:u w:val="single"/>
+        </w:rPr>
+      </w:pPr>
+      <w:r>
+        <w:rPr>
+          <w:rtl w:val="0"/>
+        </w:rPr>
+      </w:r>
+    </w:p>
+    <w:p>
+      <w:pPr>
+        <w:rPr>
+          <w:b w:val="1"/>
+          <w:bCs w:val="1"/>
+          <w:u w:val="single"/>
+        </w:rPr>
+      </w:pPr>
+      <w:r>
+        <w:rPr>
+          <w:rtl w:val="0"/>
+        </w:rPr>
+      </w:r>
+    </w:p>
+    <w:p>
+      <w:pPr>
+        <w:rPr>
+          <w:b w:val="1"/>
+          <w:bCs w:val="1"/>
+          <w:u w:val="single"/>
+        </w:rPr>
+      </w:pPr>
+      <w:r>
+        <w:rPr>
+          <w:rtl w:val="0"/>
+        </w:rPr>
+      </w:r>
+    </w:p>
+    <w:p>
+      <w:pPr>
+        <w:rPr>
+          <w:b w:val="1"/>
+          <w:bCs w:val="1"/>
+          <w:u w:val="single"/>
+        </w:rPr>
+      </w:pPr>
+      <w:r>
+        <w:rPr>
+          <w:rtl w:val="0"/>
+        </w:rPr>
+      </w:r>
+    </w:p>
+    <w:p>
+      <w:pPr>
+        <w:rPr>
+          <w:b w:val="1"/>
+          <w:bCs w:val="1"/>
+          <w:u w:val="single"/>
+        </w:rPr>
+      </w:pPr>
+      <w:r>
+        <w:rPr>
+          <w:b w:val="1"/>
+          <w:bCs w:val="1"/>
+          <w:u w:val="single"/>
+          <w:rtl w:val="0"/>
+        </w:rPr>
+        <w:t xml:space="preserve">CASOS DE USO</w:t>
+      </w:r>
+    </w:p>
+    <w:p>
+      <w:pPr>
+        <w:rPr>
+          <w:b w:val="1"/>
+          <w:bCs w:val="1"/>
+          <w:u w:val="single"/>
+        </w:rPr>
+      </w:pPr>
+      <w:r>
+        <w:rPr>
+          <w:rtl w:val="0"/>
+        </w:rPr>
+      </w:r>
+    </w:p>
+    <w:p>
+      <w:pPr>
+        <w:rPr/>
+      </w:pPr>
+      <w:r>
+        <w:rPr>
+          <w:b w:val="1"/>
+          <w:bCs w:val="1"/>
+          <w:rtl w:val="0"/>
+        </w:rPr>
+        <w:t xml:space="preserve">Nombre del caso de uso:</w:t>
+      </w:r>
+      <w:r>
+        <w:rPr>
+          <w:rtl w:val="0"/>
+        </w:rPr>
+        <w:t xml:space="preserve"> CU01: Solicitar cotización de servicio eléctrico. </w:t>
+      </w:r>
+    </w:p>
+    <w:p>
+      <w:pPr>
+        <w:rPr/>
+      </w:pPr>
+      <w:r>
+        <w:rPr>
+          <w:b w:val="1"/>
+          <w:bCs w:val="1"/>
+          <w:rtl w:val="0"/>
+        </w:rPr>
+        <w:t xml:space="preserve">Actor Principal: </w:t>
+      </w:r>
+      <w:r>
+        <w:rPr>
+          <w:rtl w:val="0"/>
+        </w:rPr>
+        <w:t xml:space="preserve">Cliente</w:t>
+      </w:r>
+    </w:p>
+    <w:p>
+      <w:pPr>
+        <w:rPr/>
+      </w:pPr>
+      <w:r>
+        <w:rPr>
+          <w:b w:val="1"/>
+          <w:bCs w:val="1"/>
+          <w:rtl w:val="0"/>
+        </w:rPr>
+        <w:t xml:space="preserve">Actor Secundario: </w:t>
+      </w:r>
+      <w:r>
+        <w:rPr>
+          <w:rtl w:val="0"/>
+        </w:rPr>
+        <w:t xml:space="preserve">Chatbot (Microservicio).</w:t>
+      </w:r>
+    </w:p>
+    <w:p>
+      <w:pPr>
+        <w:rPr/>
+      </w:pPr>
+      <w:r>
+        <w:rPr>
+          <w:b w:val="1"/>
+          <w:bCs w:val="1"/>
+          <w:rtl w:val="0"/>
+        </w:rPr>
+        <w:t xml:space="preserve">Descripción: </w:t>
+      </w:r>
+      <w:r>
+        <w:rPr>
+          <w:rtl w:val="0"/>
+        </w:rPr>
+        <w:t xml:space="preserve">El cliente interactúa con el chatbot de WhatsApp para consultar por un servicio, respondiendo a una plantilla predefinida para obtener un presupuesto estimado.</w:t>
+      </w:r>
+    </w:p>
+    <w:p>
+      <w:pPr>
+        <w:rPr/>
+      </w:pPr>
+      <w:r>
+        <w:rPr>
+          <w:b w:val="1"/>
+          <w:bCs w:val="1"/>
+          <w:rtl w:val="0"/>
+        </w:rPr>
+        <w:t xml:space="preserve">Precondiciones: </w:t>
+      </w:r>
+      <w:r>
+        <w:rPr>
+          <w:rtl w:val="0"/>
+        </w:rPr>
+        <w:t xml:space="preserve">El cliente debe tener WhatsApp y el microservicio del Chatbot debe estar activo.</w:t>
+      </w:r>
+    </w:p>
+    <w:p>
+      <w:pPr>
+        <w:rPr>
+          <w:b w:val="1"/>
+          <w:bCs w:val="1"/>
+        </w:rPr>
+      </w:pPr>
+      <w:r>
+        <w:rPr>
+          <w:b w:val="1"/>
+          <w:bCs w:val="1"/>
+          <w:rtl w:val="0"/>
+        </w:rPr>
+        <w:t xml:space="preserve">Flujo Principal</w:t>
+      </w:r>
+    </w:p>
+    <w:p>
+      <w:pPr>
+        <w:spacing w:after="240" w:lineRule="auto"/>
+        <w:rPr/>
+      </w:pPr>
+      <w:r>
+        <w:rPr>
+          <w:rtl w:val="0"/>
+        </w:rPr>
+        <w:t xml:space="preserve">1. El cliente envía un mensaje inicial al número de Servi Elec</w:t>
+      </w:r>
+    </w:p>
+    <w:p>
+      <w:pPr>
+        <w:spacing w:after="240" w:lineRule="auto"/>
+        <w:rPr/>
+      </w:pPr>
+      <w:r>
+        <w:rPr>
+          <w:rtl w:val="0"/>
+        </w:rPr>
+        <w:t xml:space="preserve">2. El chatbot despliega el menú principal</w:t>
+      </w:r>
+    </w:p>
+    <w:p>
+      <w:pPr>
+        <w:spacing w:after="240" w:lineRule="auto"/>
+        <w:rPr/>
+      </w:pPr>
+      <w:r>
+        <w:rPr>
+          <w:rtl w:val="0"/>
+        </w:rPr>
+        <w:t xml:space="preserve">3. El cliente selecciona "Cotización" y luego la categoría </w:t>
+      </w:r>
+    </w:p>
+    <w:p>
+      <w:pPr>
+        <w:spacing w:after="240" w:lineRule="auto"/>
+        <w:rPr/>
+      </w:pPr>
+      <w:r>
+        <w:rPr>
+          <w:rtl w:val="0"/>
+        </w:rPr>
+        <w:t xml:space="preserve">4. El chatbot muestra los servicios disponibles basados en la tabla plantilla</w:t>
+      </w:r>
+    </w:p>
+    <w:p>
+      <w:pPr>
+        <w:spacing w:after="240" w:lineRule="auto"/>
+        <w:rPr/>
+      </w:pPr>
+      <w:r>
+        <w:rPr>
+          <w:rtl w:val="0"/>
+        </w:rPr>
+        <w:t xml:space="preserve">5. El cliente selecciona un servicio</w:t>
+      </w:r>
+    </w:p>
+    <w:p>
+      <w:pPr>
+        <w:spacing w:after="240" w:lineRule="auto"/>
+        <w:rPr/>
+      </w:pPr>
+      <w:r>
+        <w:rPr>
+          <w:rtl w:val="0"/>
+        </w:rPr>
+        <w:t xml:space="preserve">6. El chatbot calcula y muestra el valor aproximado</w:t>
+      </w:r>
+    </w:p>
+    <w:p>
+      <w:pPr>
+        <w:spacing w:after="240" w:lineRule="auto"/>
+        <w:rPr/>
+      </w:pPr>
+      <w:r>
+        <w:rPr>
+          <w:rtl w:val="0"/>
+        </w:rPr>
+        <w:t xml:space="preserve">7. El cliente confirma su interés ("OK") y responde las preguntas específicas</w:t>
+      </w:r>
+    </w:p>
+    <w:p>
+      <w:pPr>
+        <w:spacing w:after="240" w:lineRule="auto"/>
+        <w:rPr/>
+      </w:pPr>
+      <w:r>
+        <w:rPr>
+          <w:rtl w:val="0"/>
+        </w:rPr>
+        <w:t xml:space="preserve">8. El chatbot guarda la consulta y genera un proyecto en estado "Pendiente"</w:t>
+      </w:r>
+    </w:p>
+    <w:p>
+      <w:pPr>
+        <w:rPr/>
+      </w:pPr>
+      <w:r>
+        <w:rPr>
+          <w:b w:val="1"/>
+          <w:bCs w:val="1"/>
+          <w:rtl w:val="0"/>
+        </w:rPr>
+        <w:t xml:space="preserve">Flujos Alternativos: </w:t>
+      </w:r>
+      <w:r>
+        <w:rPr>
+          <w:rtl w:val="0"/>
+        </w:rPr>
+        <w:t xml:space="preserve">En el paso 7</w:t>
+      </w:r>
+      <w:r>
+        <w:rPr>
+          <w:b w:val="1"/>
+          <w:bCs w:val="1"/>
+          <w:rtl w:val="0"/>
+        </w:rPr>
+        <w:t xml:space="preserve"> </w:t>
+      </w:r>
+      <w:r>
+        <w:rPr>
+          <w:rtl w:val="0"/>
+        </w:rPr>
+        <w:t xml:space="preserve">si el cliente no confirma interés o deja de responder, el chatbot clasifica la consulta como "Cerrada sin interés" y finaliza la interacción.</w:t>
+      </w:r>
+    </w:p>
+    <w:p>
+      <w:pPr>
+        <w:rPr/>
+      </w:pPr>
+      <w:r>
+        <w:rPr>
+          <w:b w:val="1"/>
+          <w:bCs w:val="1"/>
+          <w:rtl w:val="0"/>
+        </w:rPr>
+        <w:t xml:space="preserve">Postcondiciones: </w:t>
+      </w:r>
+      <w:r>
+        <w:rPr>
+          <w:rtl w:val="0"/>
+        </w:rPr>
+        <w:t xml:space="preserve">Se registra un proyecto pendiente en la base de datos, listo para revisión administrativa.</w:t>
+      </w:r>
+    </w:p>
+    <w:p>
+      <w:pPr>
+        <w:rPr/>
+      </w:pPr>
+      <w:r>
+        <w:rPr>
+          <w:rtl w:val="0"/>
+        </w:rPr>
+        <w:t xml:space="preserve">—------------------------------------------------------------------------------------------------------------------------</w:t>
+      </w:r>
+    </w:p>
+    <w:p>
+      <w:pPr>
+        <w:rPr/>
+      </w:pPr>
+      <w:r>
+        <w:rPr>
+          <w:b w:val="1"/>
+          <w:bCs w:val="1"/>
+          <w:rtl w:val="0"/>
+        </w:rPr>
+        <w:t xml:space="preserve">Nombre del Caso de Uso:</w:t>
+      </w:r>
+      <w:r>
+        <w:rPr>
+          <w:rtl w:val="0"/>
+        </w:rPr>
+        <w:t xml:space="preserve"> CU02: Revisar y gestionar proyecto pendiente.</w:t>
+      </w:r>
+    </w:p>
+    <w:p>
+      <w:pPr>
+        <w:rPr/>
+      </w:pPr>
+      <w:r>
+        <w:rPr>
+          <w:b w:val="1"/>
+          <w:bCs w:val="1"/>
+          <w:rtl w:val="0"/>
+        </w:rPr>
+        <w:t xml:space="preserve">Actor principal: </w:t>
+      </w:r>
+      <w:r>
+        <w:rPr>
+          <w:rtl w:val="0"/>
+        </w:rPr>
+        <w:t xml:space="preserve">Administrador.</w:t>
+      </w:r>
+    </w:p>
+    <w:p>
+      <w:pPr>
+        <w:rPr/>
+      </w:pPr>
+      <w:r>
+        <w:rPr>
+          <w:b w:val="1"/>
+          <w:bCs w:val="1"/>
+          <w:rtl w:val="0"/>
+        </w:rPr>
+        <w:t xml:space="preserve">Actor secundario: </w:t>
+      </w:r>
+      <w:r>
+        <w:rPr>
+          <w:rtl w:val="0"/>
+        </w:rPr>
+        <w:t xml:space="preserve">Sistema (Microservicio de Gestión).</w:t>
+      </w:r>
+    </w:p>
+    <w:p>
+      <w:pPr>
+        <w:rPr/>
+      </w:pPr>
+      <w:r>
+        <w:rPr>
+          <w:b w:val="1"/>
+          <w:bCs w:val="1"/>
+          <w:rtl w:val="0"/>
+        </w:rPr>
+        <w:t xml:space="preserve">Descripción: </w:t>
+      </w:r>
+      <w:r>
+        <w:rPr>
+          <w:rtl w:val="0"/>
+        </w:rPr>
+        <w:t xml:space="preserve">El administrador visualiza en el panel web los proyectos generados por el chatbot, verifica los materiales necesarios y aprueba el proyecto para su ejecución.</w:t>
+      </w:r>
+    </w:p>
+    <w:p>
+      <w:pPr>
+        <w:rPr>
+          <w:b w:val="1"/>
+          <w:bCs w:val="1"/>
+        </w:rPr>
+      </w:pPr>
+      <w:r>
+        <w:rPr>
+          <w:b w:val="1"/>
+          <w:bCs w:val="1"/>
+          <w:rtl w:val="0"/>
+        </w:rPr>
+        <w:t xml:space="preserve">Precondiciones</w:t>
+      </w:r>
+    </w:p>
+    <w:p>
+      <w:pPr>
+        <w:spacing w:after="240" w:lineRule="auto"/>
+        <w:rPr/>
+      </w:pPr>
+      <w:r>
+        <w:rPr>
+          <w:rtl w:val="0"/>
+        </w:rPr>
+        <w:t xml:space="preserve">1. El Administrador inició sesión en la plataforma web.</w:t>
+      </w:r>
+    </w:p>
+    <w:p>
+      <w:pPr>
+        <w:spacing w:after="240" w:lineRule="auto"/>
+        <w:rPr/>
+      </w:pPr>
+      <w:r>
+        <w:rPr>
+          <w:rtl w:val="0"/>
+        </w:rPr>
+        <w:t xml:space="preserve">2. Existe al menos un proyecto en estado "Pendiente".</w:t>
+      </w:r>
+    </w:p>
+    <w:p>
+      <w:pPr>
+        <w:rPr>
+          <w:b w:val="1"/>
+          <w:bCs w:val="1"/>
+        </w:rPr>
+      </w:pPr>
+      <w:r>
+        <w:rPr>
+          <w:b w:val="1"/>
+          <w:bCs w:val="1"/>
+          <w:rtl w:val="0"/>
+        </w:rPr>
+        <w:t xml:space="preserve">Flujo Principal</w:t>
+      </w:r>
+    </w:p>
+    <w:p>
+      <w:pPr>
+        <w:spacing w:after="240" w:lineRule="auto"/>
+        <w:rPr/>
+      </w:pPr>
+      <w:r>
+        <w:rPr>
+          <w:rtl w:val="0"/>
+        </w:rPr>
+        <w:t xml:space="preserve">1. El administrador accede al módulo de "Proyectos".</w:t>
+      </w:r>
+    </w:p>
+    <w:p>
+      <w:pPr>
+        <w:spacing w:after="240" w:lineRule="auto"/>
+        <w:rPr/>
+      </w:pPr>
+      <w:r>
+        <w:rPr>
+          <w:rtl w:val="0"/>
+        </w:rPr>
+        <w:t xml:space="preserve">2. El sistema lista las obras pendientes de revisión.</w:t>
+      </w:r>
+    </w:p>
+    <w:p>
+      <w:pPr>
+        <w:spacing w:after="240" w:lineRule="auto"/>
+        <w:rPr/>
+      </w:pPr>
+      <w:r>
+        <w:rPr>
+          <w:rtl w:val="0"/>
+        </w:rPr>
+        <w:t xml:space="preserve">3. El administrador selecciona un proyecto para ver sus detalles (cliente, presupuesto estimado, materiales sugeridos).</w:t>
+      </w:r>
+    </w:p>
+    <w:p>
+      <w:pPr>
+        <w:spacing w:after="240" w:lineRule="auto"/>
+        <w:rPr/>
+      </w:pPr>
+      <w:r>
+        <w:rPr>
+          <w:rtl w:val="0"/>
+        </w:rPr>
+        <w:t xml:space="preserve">4. El administrador verifica si hay stock suficiente en el inventario.</w:t>
+      </w:r>
+    </w:p>
+    <w:p>
+      <w:pPr>
+        <w:spacing w:after="240" w:lineRule="auto"/>
+        <w:rPr/>
+      </w:pPr>
+      <w:r>
+        <w:rPr>
+          <w:rtl w:val="0"/>
+        </w:rPr>
+        <w:t xml:space="preserve">5. El administrador aprueba el proyecto.</w:t>
+      </w:r>
+    </w:p>
+    <w:p>
+      <w:pPr>
+        <w:spacing w:after="240" w:lineRule="auto"/>
+        <w:rPr/>
+      </w:pPr>
+      <w:r>
+        <w:rPr>
+          <w:rtl w:val="0"/>
+        </w:rPr>
+        <w:t xml:space="preserve">6. El sistema cambia el estado del proyecto a "En curso".</w:t>
+      </w:r>
+    </w:p>
+    <w:p>
+      <w:pPr>
+        <w:rPr>
+          <w:b w:val="1"/>
+          <w:bCs w:val="1"/>
+        </w:rPr>
+      </w:pPr>
+      <w:r>
+        <w:rPr>
+          <w:b w:val="1"/>
+          <w:bCs w:val="1"/>
+          <w:rtl w:val="0"/>
+        </w:rPr>
+        <w:t xml:space="preserve">Flujos Alternativos </w:t>
+      </w:r>
+    </w:p>
+    <w:p>
+      <w:pPr>
+        <w:rPr/>
+      </w:pPr>
+      <w:r>
+        <w:rPr>
+          <w:rtl w:val="0"/>
+        </w:rPr>
+        <w:t xml:space="preserve">En el</w:t>
+      </w:r>
+      <w:r>
+        <w:rPr>
+          <w:b w:val="1"/>
+          <w:bCs w:val="1"/>
+          <w:rtl w:val="0"/>
+        </w:rPr>
+        <w:t xml:space="preserve"> </w:t>
+      </w:r>
+      <w:r>
+        <w:rPr>
+          <w:rtl w:val="0"/>
+        </w:rPr>
+        <w:t xml:space="preserve">paso 4a si faltan materiales o la información es incorrecta, el Administrador deja el proyecto "En ajuste" y contacta al cliente para afinar detalles.</w:t>
+      </w:r>
+    </w:p>
+    <w:p>
+      <w:pPr>
+        <w:rPr/>
+      </w:pPr>
+      <w:r>
+        <w:rPr>
+          <w:rtl w:val="0"/>
+        </w:rPr>
+      </w:r>
+    </w:p>
+    <w:p>
+      <w:pPr>
+        <w:spacing w:after="240" w:lineRule="auto"/>
+        <w:rPr/>
+      </w:pPr>
+      <w:r>
+        <w:rPr>
+          <w:rtl w:val="0"/>
+        </w:rPr>
+        <w:t xml:space="preserve">En el paso 5a: El Administrador rechaza la solicitud y el sistema cambia el estado a "Cancelado".</w:t>
+      </w:r>
+    </w:p>
+    <w:p>
+      <w:pPr>
+        <w:rPr/>
+      </w:pPr>
+      <w:r>
+        <w:rPr>
+          <w:b w:val="1"/>
+          <w:bCs w:val="1"/>
+          <w:rtl w:val="0"/>
+        </w:rPr>
+        <w:t xml:space="preserve">Postcondiciones: </w:t>
+      </w:r>
+      <w:r>
+        <w:rPr>
+          <w:rtl w:val="0"/>
+        </w:rPr>
+        <w:t xml:space="preserve">El proyecto queda habilitado para su ejecución en terreno y se pueden comenzar a asignar materiales físicos a la obra. </w:t>
+      </w:r>
+    </w:p>
+    <w:p>
+      <w:pPr>
+        <w:rPr/>
+      </w:pPr>
+      <w:r>
+        <w:rPr>
+          <w:rtl w:val="0"/>
+        </w:rPr>
+        <w:t xml:space="preserve">—------------------------------------------------------------------------------------------------------------------------</w:t>
+      </w:r>
+    </w:p>
+    <w:p>
+      <w:pPr>
+        <w:rPr/>
+      </w:pPr>
+      <w:r>
+        <w:rPr>
+          <w:rtl w:val="0"/>
+        </w:rPr>
+      </w:r>
+    </w:p>
+    <w:p>
+      <w:pPr>
+        <w:rPr/>
+      </w:pPr>
+      <w:r>
+        <w:rPr>
+          <w:b w:val="1"/>
+          <w:bCs w:val="1"/>
+          <w:rtl w:val="0"/>
+        </w:rPr>
+        <w:t xml:space="preserve">Nombre del Caso de Uso: </w:t>
+      </w:r>
+      <w:r>
+        <w:rPr>
+          <w:rtl w:val="0"/>
+        </w:rPr>
+        <w:t xml:space="preserve">CU03: Registrar consumo de materiales.</w:t>
+      </w:r>
+    </w:p>
+    <w:p>
+      <w:pPr>
+        <w:rPr/>
+      </w:pPr>
+      <w:r>
+        <w:rPr>
+          <w:b w:val="1"/>
+          <w:bCs w:val="1"/>
+          <w:rtl w:val="0"/>
+        </w:rPr>
+        <w:t xml:space="preserve">Actor Principal: </w:t>
+      </w:r>
+      <w:r>
+        <w:rPr>
+          <w:rtl w:val="0"/>
+        </w:rPr>
+        <w:t xml:space="preserve">Administrador / Técnico.</w:t>
+      </w:r>
+    </w:p>
+    <w:p>
+      <w:pPr>
+        <w:rPr/>
+      </w:pPr>
+      <w:r>
+        <w:rPr>
+          <w:b w:val="1"/>
+          <w:bCs w:val="1"/>
+          <w:rtl w:val="0"/>
+        </w:rPr>
+        <w:t xml:space="preserve">Actor Secundario: </w:t>
+      </w:r>
+      <w:r>
+        <w:rPr>
+          <w:rtl w:val="0"/>
+        </w:rPr>
+        <w:t xml:space="preserve">Sistema (Base de datos PostgreSQL).</w:t>
+      </w:r>
+    </w:p>
+    <w:p>
+      <w:pPr>
+        <w:rPr/>
+      </w:pPr>
+      <w:r>
+        <w:rPr>
+          <w:b w:val="1"/>
+          <w:bCs w:val="1"/>
+          <w:rtl w:val="0"/>
+        </w:rPr>
+        <w:t xml:space="preserve">Descripción: </w:t>
+      </w:r>
+      <w:r>
+        <w:rPr>
+          <w:rtl w:val="0"/>
+        </w:rPr>
+        <w:t xml:space="preserve">Permite registrar la salida de insumos desde el inventario para ser utilizados en un proyecto específico, afectando el presupuesto final.</w:t>
+      </w:r>
+    </w:p>
+    <w:p>
+      <w:pPr>
+        <w:rPr/>
+      </w:pPr>
+      <w:r>
+        <w:rPr>
+          <w:b w:val="1"/>
+          <w:bCs w:val="1"/>
+          <w:rtl w:val="0"/>
+        </w:rPr>
+        <w:t xml:space="preserve">Precondiciones: </w:t>
+      </w:r>
+      <w:r>
+        <w:rPr>
+          <w:rtl w:val="0"/>
+        </w:rPr>
+        <w:t xml:space="preserve">El proyecto debe estar en estado "En curso" y deben existir materiales creados en el módulo de inventario.</w:t>
+      </w:r>
+    </w:p>
+    <w:p>
+      <w:pPr>
+        <w:rPr>
+          <w:b w:val="1"/>
+          <w:bCs w:val="1"/>
+        </w:rPr>
+      </w:pPr>
+      <w:r>
+        <w:rPr>
+          <w:b w:val="1"/>
+          <w:bCs w:val="1"/>
+          <w:rtl w:val="0"/>
+        </w:rPr>
+        <w:t xml:space="preserve">Flujo Principal</w:t>
+      </w:r>
+    </w:p>
+    <w:p>
+      <w:pPr>
+        <w:spacing w:after="240" w:lineRule="auto"/>
+        <w:rPr/>
+      </w:pPr>
+      <w:r>
+        <w:rPr>
+          <w:rtl w:val="0"/>
+        </w:rPr>
+        <w:t xml:space="preserve">1. El usuario ingresa a la vista del proyecto en curso</w:t>
+      </w:r>
+    </w:p>
+    <w:p>
+      <w:pPr>
+        <w:spacing w:after="240" w:lineRule="auto"/>
+        <w:rPr/>
+      </w:pPr>
+      <w:r>
+        <w:rPr>
+          <w:rtl w:val="0"/>
+        </w:rPr>
+        <w:t xml:space="preserve">2. Selecciona la opción de añadir materiales</w:t>
+      </w:r>
+    </w:p>
+    <w:p>
+      <w:pPr>
+        <w:spacing w:after="240" w:lineRule="auto"/>
+        <w:rPr/>
+      </w:pPr>
+      <w:r>
+        <w:rPr>
+          <w:rtl w:val="0"/>
+        </w:rPr>
+        <w:t xml:space="preserve">3. Busca el insumo requerido en el inventario</w:t>
+      </w:r>
+    </w:p>
+    <w:p>
+      <w:pPr>
+        <w:spacing w:after="240" w:lineRule="auto"/>
+        <w:rPr/>
+      </w:pPr>
+      <w:r>
+        <w:rPr>
+          <w:rtl w:val="0"/>
+        </w:rPr>
+        <w:t xml:space="preserve">4. Ingresa la cantidad a utilizar y confirma la acción</w:t>
+      </w:r>
+    </w:p>
+    <w:p>
+      <w:pPr>
+        <w:spacing w:after="240" w:lineRule="auto"/>
+        <w:rPr/>
+      </w:pPr>
+      <w:r>
+        <w:rPr>
+          <w:rtl w:val="0"/>
+        </w:rPr>
+        <w:t xml:space="preserve">5. El sistema genera un registro en la tabla de movimiento vinculando al usuario, el proyecto y el material.</w:t>
+      </w:r>
+    </w:p>
+    <w:p>
+      <w:pPr>
+        <w:spacing w:after="240" w:lineRule="auto"/>
+        <w:rPr/>
+      </w:pPr>
+      <w:r>
+        <w:rPr>
+          <w:rtl w:val="0"/>
+        </w:rPr>
+        <w:t xml:space="preserve">6. El sistema descuenta la cantidad del stock actual en la tabla material.</w:t>
+      </w:r>
+    </w:p>
+    <w:p>
+      <w:pPr>
+        <w:rPr/>
+      </w:pPr>
+      <w:r>
+        <w:rPr>
+          <w:b w:val="1"/>
+          <w:bCs w:val="1"/>
+          <w:rtl w:val="0"/>
+        </w:rPr>
+        <w:t xml:space="preserve">Flujos Alternativos: </w:t>
+      </w:r>
+      <w:r>
+        <w:rPr>
+          <w:rtl w:val="0"/>
+        </w:rPr>
+        <w:t xml:space="preserve">En el paso 6, Si al descontar el material se alcanza el límite de stock critico, el sistema genera una alerta visual indicando que se debe reabastecer el insumo.</w:t>
+      </w:r>
+    </w:p>
+    <w:p>
+      <w:pPr>
+        <w:rPr/>
+      </w:pPr>
+      <w:r>
+        <w:rPr>
+          <w:b w:val="1"/>
+          <w:bCs w:val="1"/>
+          <w:rtl w:val="0"/>
+        </w:rPr>
+        <w:t xml:space="preserve">Postcondiciones: </w:t>
+      </w:r>
+      <w:r>
+        <w:rPr>
+          <w:rtl w:val="0"/>
+        </w:rPr>
+        <w:t xml:space="preserve">El stock se actualiza en tiempo real y el costo del material se suma al </w:t>
+      </w:r>
+      <w:r>
+        <w:rPr>
+          <w:rtl w:val="0"/>
+        </w:rPr>
+        <w:t xml:space="preserve">presupuesto final</w:t>
+      </w:r>
+      <w:r>
+        <w:rPr>
+          <w:rtl w:val="0"/>
+        </w:rPr>
+        <w:t xml:space="preserve"> de la obra.</w:t>
+      </w:r>
+    </w:p>
+    <w:p>
+      <w:pPr>
+        <w:rPr/>
+      </w:pPr>
+      <w:r>
+        <w:rPr>
+          <w:rtl w:val="0"/>
+        </w:rPr>
+        <w:t xml:space="preserve">—------------------------------------------------------------------------------------------------------------------------</w:t>
+      </w:r>
+    </w:p>
+    <w:p>
+      <w:pPr>
+        <w:rPr/>
+      </w:pPr>
+      <w:r>
+        <w:rPr>
+          <w:b w:val="1"/>
+          <w:bCs w:val="1"/>
+          <w:rtl w:val="0"/>
+        </w:rPr>
+        <w:t xml:space="preserve">Nombre del Caso de Uso: </w:t>
+      </w:r>
+      <w:r>
+        <w:rPr>
+          <w:rtl w:val="0"/>
+        </w:rPr>
+        <w:t xml:space="preserve">CU04: Utilizar comparador de precios.</w:t>
+      </w:r>
+    </w:p>
+    <w:p>
+      <w:pPr>
+        <w:rPr/>
+      </w:pPr>
+      <w:r>
+        <w:rPr>
+          <w:b w:val="1"/>
+          <w:bCs w:val="1"/>
+          <w:rtl w:val="0"/>
+        </w:rPr>
+        <w:t xml:space="preserve">Actor Principal: </w:t>
+      </w:r>
+      <w:r>
+        <w:rPr>
+          <w:rtl w:val="0"/>
+        </w:rPr>
+        <w:t xml:space="preserve">Administrador.</w:t>
+      </w:r>
+    </w:p>
+    <w:p>
+      <w:pPr>
+        <w:rPr/>
+      </w:pPr>
+      <w:r>
+        <w:rPr>
+          <w:b w:val="1"/>
+          <w:bCs w:val="1"/>
+          <w:rtl w:val="0"/>
+        </w:rPr>
+        <w:t xml:space="preserve">Actor Secundario: </w:t>
+      </w:r>
+      <w:r>
+        <w:rPr>
+          <w:rtl w:val="0"/>
+        </w:rPr>
+        <w:t xml:space="preserve">Fuentes externas de precios (API/Scraping).</w:t>
+      </w:r>
+    </w:p>
+    <w:p>
+      <w:pPr>
+        <w:rPr/>
+      </w:pPr>
+      <w:r>
+        <w:rPr>
+          <w:b w:val="1"/>
+          <w:bCs w:val="1"/>
+          <w:rtl w:val="0"/>
+        </w:rPr>
+        <w:t xml:space="preserve">Descripción: </w:t>
+      </w:r>
+      <w:r>
+        <w:rPr>
+          <w:rtl w:val="0"/>
+        </w:rPr>
+        <w:t xml:space="preserve">El Administrador busca materiales que no tienen stock o que faltan para un proyecto y el sistema compara precios de referencia en el mercado.</w:t>
+      </w:r>
+    </w:p>
+    <w:p>
+      <w:pPr>
+        <w:rPr/>
+      </w:pPr>
+      <w:r>
+        <w:rPr>
+          <w:b w:val="1"/>
+          <w:bCs w:val="1"/>
+          <w:rtl w:val="0"/>
+        </w:rPr>
+        <w:t xml:space="preserve">Precondiciones: </w:t>
+      </w:r>
+      <w:r>
+        <w:rPr>
+          <w:rtl w:val="0"/>
+        </w:rPr>
+        <w:t xml:space="preserve">El Administrador debe tener sesión iniciada en el sistema web.</w:t>
+      </w:r>
+    </w:p>
+    <w:p>
+      <w:pPr>
+        <w:rPr>
+          <w:b w:val="1"/>
+          <w:bCs w:val="1"/>
+        </w:rPr>
+      </w:pPr>
+      <w:r>
+        <w:rPr>
+          <w:b w:val="1"/>
+          <w:bCs w:val="1"/>
+          <w:rtl w:val="0"/>
+        </w:rPr>
+        <w:t xml:space="preserve">Flujo Principal</w:t>
+      </w:r>
+    </w:p>
+    <w:p>
+      <w:pPr>
+        <w:spacing w:after="240" w:before="240" w:lineRule="auto"/>
+        <w:rPr/>
+      </w:pPr>
+      <w:r>
+        <w:rPr>
+          <w:rtl w:val="0"/>
+        </w:rPr>
+        <w:t xml:space="preserve">1. El Administrador accede al buscador de materiales.</w:t>
+      </w:r>
+    </w:p>
+    <w:p>
+      <w:pPr>
+        <w:spacing w:after="240" w:before="240" w:lineRule="auto"/>
+        <w:rPr/>
+      </w:pPr>
+      <w:r>
+        <w:rPr>
+          <w:rtl w:val="0"/>
+        </w:rPr>
+        <w:t xml:space="preserve">2. Ingresa el nombre del material a cotizar.</w:t>
+      </w:r>
+    </w:p>
+    <w:p>
+      <w:pPr>
+        <w:spacing w:after="240" w:before="240" w:lineRule="auto"/>
+        <w:rPr/>
+      </w:pPr>
+      <w:r>
+        <w:rPr>
+          <w:rtl w:val="0"/>
+        </w:rPr>
+        <w:t xml:space="preserve">3. Activa la opción "Comparar precios".</w:t>
+      </w:r>
+    </w:p>
+    <w:p>
+      <w:pPr>
+        <w:spacing w:after="240" w:before="240" w:lineRule="auto"/>
+        <w:rPr/>
+      </w:pPr>
+      <w:r>
+        <w:rPr>
+          <w:rtl w:val="0"/>
+        </w:rPr>
+        <w:t xml:space="preserve">4. El microservicio de gestión consulta fuentes externas (proveedores de referencia).</w:t>
+      </w:r>
+    </w:p>
+    <w:p>
+      <w:pPr>
+        <w:spacing w:after="240" w:before="240" w:lineRule="auto"/>
+        <w:rPr/>
+      </w:pPr>
+      <w:r>
+        <w:rPr>
+          <w:rtl w:val="0"/>
+        </w:rPr>
+        <w:t xml:space="preserve">5. El sistema muestra una lista comparativa con los precios encontrados.</w:t>
+      </w:r>
+    </w:p>
+    <w:p>
+      <w:pPr>
+        <w:spacing w:after="240" w:before="240" w:lineRule="auto"/>
+        <w:rPr/>
+      </w:pPr>
+      <w:r>
+        <w:rPr>
+          <w:rtl w:val="0"/>
+        </w:rPr>
+        <w:t xml:space="preserve">6. El Administrador toma la decisión de compra para abastecer el inventario.</w:t>
+      </w:r>
+    </w:p>
+    <w:p>
+      <w:pPr>
+        <w:rPr/>
+      </w:pPr>
+      <w:r>
+        <w:rPr>
+          <w:b w:val="1"/>
+          <w:bCs w:val="1"/>
+          <w:rtl w:val="0"/>
+        </w:rPr>
+        <w:t xml:space="preserve">Flujos Alternativos: </w:t>
+      </w:r>
+      <w:r>
+        <w:rPr>
+          <w:rtl w:val="0"/>
+        </w:rPr>
+        <w:t xml:space="preserve">En el paso 4</w:t>
+      </w:r>
+      <w:r>
+        <w:rPr>
+          <w:b w:val="1"/>
+          <w:bCs w:val="1"/>
+          <w:rtl w:val="0"/>
+        </w:rPr>
+        <w:t xml:space="preserve">,</w:t>
+      </w:r>
+      <w:r>
+        <w:rPr>
+          <w:rtl w:val="0"/>
+        </w:rPr>
+        <w:t xml:space="preserve"> Si la fuente externa no responde o no se encuentra el producto, el sistema arroja un mensaje de "Material no encontrado en la base de referencia" y permite el ingreso manual del costo.</w:t>
+      </w:r>
+    </w:p>
+    <w:p>
+      <w:pPr>
+        <w:rPr/>
+      </w:pPr>
+      <w:r>
+        <w:rPr>
+          <w:b w:val="1"/>
+          <w:bCs w:val="1"/>
+          <w:rtl w:val="0"/>
+        </w:rPr>
+        <w:t xml:space="preserve">Postcondiciones: </w:t>
+      </w:r>
+      <w:r>
+        <w:rPr>
+          <w:rtl w:val="0"/>
+        </w:rPr>
+        <w:t xml:space="preserve">El Administrador obtiene la información necesaria para optimizar los costos de adquisición de insumos. </w:t>
+      </w:r>
+    </w:p>
+    <w:p>
+      <w:pPr>
+        <w:rPr>
+          <w:b w:val="1"/>
+          <w:bCs w:val="1"/>
+          <w:u w:val="single"/>
+        </w:rPr>
+      </w:pPr>
+      <w:r>
+        <w:rPr>
+          <w:rtl w:val="0"/>
+        </w:rPr>
+      </w:r>
+    </w:p>
+    <w:p>
+      <w:pPr>
+        <w:rPr/>
+      </w:pPr>
+      <w:r>
+        <w:rPr>
+          <w:rtl w:val="0"/>
+        </w:rPr>
+        <w:t xml:space="preserve">—------------------------------------------------------------------------------------------------------------------------</w:t>
+      </w:r>
+    </w:p>
+    <w:p>
+      <w:pPr>
+        <w:rPr/>
+      </w:pPr>
+      <w:r>
+        <w:rPr>
+          <w:rtl w:val="0"/>
+        </w:rPr>
+      </w:r>
+    </w:p>
+    <w:p>
+      <w:pPr>
+        <w:rPr/>
+      </w:pPr>
+      <w:r>
+        <w:rPr>
+          <w:b w:val="1"/>
+          <w:bCs w:val="1"/>
+          <w:rtl w:val="0"/>
+        </w:rPr>
+        <w:t xml:space="preserve">Nombre del Caso de Uso:</w:t>
+      </w:r>
+      <w:r>
+        <w:rPr>
+          <w:rtl w:val="0"/>
+        </w:rPr>
+        <w:t xml:space="preserve"> CU05: Iniciar sesión de usuario.</w:t>
+      </w:r>
+    </w:p>
+    <w:p>
+      <w:pPr>
+        <w:rPr/>
+      </w:pPr>
+      <w:r>
+        <w:rPr>
+          <w:b w:val="1"/>
+          <w:bCs w:val="1"/>
+          <w:rtl w:val="0"/>
+        </w:rPr>
+        <w:t xml:space="preserve">Actor Principal:</w:t>
+      </w:r>
+      <w:r>
+        <w:rPr>
+          <w:rtl w:val="0"/>
+        </w:rPr>
+        <w:t xml:space="preserve"> Administrador / Técnico.</w:t>
+      </w:r>
+    </w:p>
+    <w:p>
+      <w:pPr>
+        <w:rPr/>
+      </w:pPr>
+      <w:r>
+        <w:rPr>
+          <w:b w:val="1"/>
+          <w:bCs w:val="1"/>
+          <w:rtl w:val="0"/>
+        </w:rPr>
+        <w:t xml:space="preserve">Actor Secundario:</w:t>
+      </w:r>
+      <w:r>
+        <w:rPr>
+          <w:rtl w:val="0"/>
+        </w:rPr>
+        <w:t xml:space="preserve"> Sistema (Microservicio de Gestión / Base de Datos).</w:t>
+      </w:r>
+    </w:p>
+    <w:p>
+      <w:pPr>
+        <w:rPr/>
+      </w:pPr>
+      <w:r>
+        <w:rPr>
+          <w:b w:val="1"/>
+          <w:bCs w:val="1"/>
+          <w:rtl w:val="0"/>
+        </w:rPr>
+        <w:t xml:space="preserve">Descripción:</w:t>
+      </w:r>
+      <w:r>
+        <w:rPr>
+          <w:rtl w:val="0"/>
+        </w:rPr>
+        <w:t xml:space="preserve"> Permite a los trabajadores de Servi Elec acceder al panel de administración verificando sus credenciales de forma segura.</w:t>
+      </w:r>
+    </w:p>
+    <w:p>
+      <w:pPr>
+        <w:rPr/>
+      </w:pPr>
+      <w:r>
+        <w:rPr>
+          <w:b w:val="1"/>
+          <w:bCs w:val="1"/>
+          <w:rtl w:val="0"/>
+        </w:rPr>
+        <w:t xml:space="preserve">Precondiciones: </w:t>
+      </w:r>
+      <w:r>
+        <w:rPr>
+          <w:rtl w:val="0"/>
+        </w:rPr>
+        <w:t xml:space="preserve">El usuario debe estar previamente registrado en la tabla usuario con su correo, contraseña y un rol definido.</w:t>
+      </w:r>
+    </w:p>
+    <w:p>
+      <w:pPr>
+        <w:rPr>
+          <w:b w:val="1"/>
+          <w:bCs w:val="1"/>
+        </w:rPr>
+      </w:pPr>
+      <w:r>
+        <w:rPr>
+          <w:b w:val="1"/>
+          <w:bCs w:val="1"/>
+          <w:rtl w:val="0"/>
+        </w:rPr>
+        <w:t xml:space="preserve">Flujo Principal</w:t>
+      </w:r>
+    </w:p>
+    <w:p>
+      <w:pPr>
+        <w:spacing w:after="240" w:before="240" w:lineRule="auto"/>
+        <w:rPr/>
+      </w:pPr>
+      <w:r>
+        <w:rPr>
+          <w:rtl w:val="0"/>
+        </w:rPr>
+        <w:t xml:space="preserve">1. El usuario ingresa a la URL de ServiElec Manager.</w:t>
+      </w:r>
+    </w:p>
+    <w:p>
+      <w:pPr>
+        <w:spacing w:after="240" w:before="240" w:lineRule="auto"/>
+        <w:rPr/>
+      </w:pPr>
+      <w:r>
+        <w:rPr>
+          <w:rtl w:val="0"/>
+        </w:rPr>
+        <w:t xml:space="preserve">2. El sistema muestra el formulario de inicio de sesión.</w:t>
+      </w:r>
+    </w:p>
+    <w:p>
+      <w:pPr>
+        <w:spacing w:after="240" w:before="240" w:lineRule="auto"/>
+        <w:rPr/>
+      </w:pPr>
+      <w:r>
+        <w:rPr>
+          <w:rtl w:val="0"/>
+        </w:rPr>
+        <w:t xml:space="preserve">3. El usuario ingresa su correo electrónico y contraseña.</w:t>
+      </w:r>
+    </w:p>
+    <w:p>
+      <w:pPr>
+        <w:spacing w:after="240" w:before="240" w:lineRule="auto"/>
+        <w:rPr/>
+      </w:pPr>
+      <w:r>
+        <w:rPr>
+          <w:rtl w:val="0"/>
+        </w:rPr>
+        <w:t xml:space="preserve">4. El usuario hace clic en "Ingresar".</w:t>
+      </w:r>
+    </w:p>
+    <w:p>
+      <w:pPr>
+        <w:spacing w:after="240" w:before="240" w:lineRule="auto"/>
+        <w:rPr/>
+      </w:pPr>
+      <w:r>
+        <w:rPr>
+          <w:rtl w:val="0"/>
+        </w:rPr>
+        <w:t xml:space="preserve">5. El sistema valida las credenciales verificando el hash en la base de datos.</w:t>
+      </w:r>
+    </w:p>
+    <w:p>
+      <w:pPr>
+        <w:spacing w:after="240" w:before="240" w:lineRule="auto"/>
+        <w:rPr/>
+      </w:pPr>
+      <w:r>
+        <w:rPr>
+          <w:rtl w:val="0"/>
+        </w:rPr>
+        <w:t xml:space="preserve">6. El sistema genera un token de seguridad (JWT) y redirige al panel principal (Dashboard).</w:t>
+      </w:r>
+    </w:p>
+    <w:p>
+      <w:pPr>
+        <w:rPr/>
+      </w:pPr>
+      <w:r>
+        <w:rPr>
+          <w:b w:val="1"/>
+          <w:bCs w:val="1"/>
+          <w:rtl w:val="0"/>
+        </w:rPr>
+        <w:t xml:space="preserve">Flujos Alternativos</w:t>
+      </w:r>
+      <w:r>
+        <w:rPr>
+          <w:rtl w:val="0"/>
+        </w:rPr>
+        <w:t xml:space="preserve"> En el paso 5a (Credenciales inválidas): Si la contraseña o correo son incorrectos, el sistema arroja un mensaje de error y deniega el acceso, manteniendo al usuario en la pantalla de login.</w:t>
+      </w:r>
+    </w:p>
+    <w:p>
+      <w:pPr>
+        <w:rPr/>
+      </w:pPr>
+      <w:r>
+        <w:rPr>
+          <w:b w:val="1"/>
+          <w:bCs w:val="1"/>
+          <w:rtl w:val="0"/>
+        </w:rPr>
+        <w:t xml:space="preserve">Postcondiciones</w:t>
+      </w:r>
+      <w:r>
+        <w:rPr>
+          <w:rtl w:val="0"/>
+        </w:rPr>
+        <w:t xml:space="preserve">: El usuario accede al sistema con los permisos correspondientes a su rol (Admin o Técnico).</w:t>
+      </w:r>
+    </w:p>
+    <w:p>
+      <w:pPr>
+        <w:rPr/>
+      </w:pPr>
+      <w:r>
+        <w:rPr>
+          <w:rtl w:val="0"/>
+        </w:rPr>
+      </w:r>
+    </w:p>
+    <w:p>
+      <w:pPr>
+        <w:rPr/>
+      </w:pPr>
+      <w:r>
+        <w:rPr>
+          <w:rtl w:val="0"/>
+        </w:rPr>
+        <w:t xml:space="preserve">—------------------------------------------------------------------------------------------------------------------------</w:t>
+      </w:r>
+    </w:p>
+    <w:p>
+      <w:pPr>
+        <w:rPr/>
+      </w:pPr>
+      <w:r>
+        <w:rPr>
+          <w:rtl w:val="0"/>
+        </w:rPr>
+      </w:r>
+    </w:p>
+    <w:p>
+      <w:pPr>
+        <w:rPr>
+          <w:b w:val="1"/>
+          <w:bCs w:val="1"/>
+          <w:u w:val="single"/>
+        </w:rPr>
+      </w:pPr>
+      <w:r>
+        <w:rPr>
+          <w:rtl w:val="0"/>
+        </w:rPr>
+      </w:r>
+    </w:p>
+    <w:p>
+      <w:pPr>
+        <w:rPr/>
+      </w:pPr>
+      <w:r>
+        <w:rPr>
+          <w:b w:val="1"/>
+          <w:bCs w:val="1"/>
+          <w:rtl w:val="0"/>
+        </w:rPr>
+        <w:t xml:space="preserve">Nombre del Caso de Uso: </w:t>
+      </w:r>
+      <w:r>
+        <w:rPr>
+          <w:rtl w:val="0"/>
+        </w:rPr>
+        <w:t xml:space="preserve">CU06: Gestionar catálogo de inventario.</w:t>
+      </w:r>
+    </w:p>
+    <w:p>
+      <w:pPr>
+        <w:rPr/>
+      </w:pPr>
+      <w:r>
+        <w:rPr>
+          <w:b w:val="1"/>
+          <w:bCs w:val="1"/>
+          <w:rtl w:val="0"/>
+        </w:rPr>
+        <w:t xml:space="preserve">Actor Principal: </w:t>
+      </w:r>
+      <w:r>
+        <w:rPr>
+          <w:rtl w:val="0"/>
+        </w:rPr>
+        <w:t xml:space="preserve">Administrador.</w:t>
+      </w:r>
+    </w:p>
+    <w:p>
+      <w:pPr>
+        <w:rPr/>
+      </w:pPr>
+      <w:r>
+        <w:rPr>
+          <w:b w:val="1"/>
+          <w:bCs w:val="1"/>
+          <w:rtl w:val="0"/>
+        </w:rPr>
+        <w:t xml:space="preserve">Actor Secundario: </w:t>
+      </w:r>
+      <w:r>
+        <w:rPr>
+          <w:rtl w:val="0"/>
+        </w:rPr>
+        <w:t xml:space="preserve">Sistema (Base de Datos).</w:t>
+      </w:r>
+    </w:p>
+    <w:p>
+      <w:pPr>
+        <w:rPr/>
+      </w:pPr>
+      <w:r>
+        <w:rPr>
+          <w:b w:val="1"/>
+          <w:bCs w:val="1"/>
+          <w:rtl w:val="0"/>
+        </w:rPr>
+        <w:t xml:space="preserve">Descripción: </w:t>
+      </w:r>
+      <w:r>
+        <w:rPr>
+          <w:rtl w:val="0"/>
+        </w:rPr>
+        <w:t xml:space="preserve">Permite al administrador crear nuevos materiales en el sistema, actualizar sus precios, modificar su descripción o establecer sus umbrales de stock crítico.</w:t>
+      </w:r>
+    </w:p>
+    <w:p>
+      <w:pPr>
+        <w:rPr/>
+      </w:pPr>
+      <w:r>
+        <w:rPr>
+          <w:b w:val="1"/>
+          <w:bCs w:val="1"/>
+          <w:rtl w:val="0"/>
+        </w:rPr>
+        <w:t xml:space="preserve">Precondiciones: </w:t>
+      </w:r>
+      <w:r>
+        <w:rPr>
+          <w:rtl w:val="0"/>
+        </w:rPr>
+        <w:t xml:space="preserve">El administrador debe tener sesión iniciada con rol de "Admin".</w:t>
+      </w:r>
+    </w:p>
+    <w:p>
+      <w:pPr>
+        <w:rPr>
+          <w:b w:val="1"/>
+          <w:bCs w:val="1"/>
+        </w:rPr>
+      </w:pPr>
+      <w:r>
+        <w:rPr>
+          <w:b w:val="1"/>
+          <w:bCs w:val="1"/>
+          <w:rtl w:val="0"/>
+        </w:rPr>
+        <w:t xml:space="preserve">Flujo Principal</w:t>
+      </w:r>
+    </w:p>
+    <w:p>
+      <w:pPr>
+        <w:spacing w:after="240" w:before="240" w:lineRule="auto"/>
+        <w:rPr/>
+      </w:pPr>
+      <w:r>
+        <w:rPr>
+          <w:rtl w:val="0"/>
+        </w:rPr>
+        <w:t xml:space="preserve">1. El administrador navega a la sección "Inventario".</w:t>
+      </w:r>
+    </w:p>
+    <w:p>
+      <w:pPr>
+        <w:spacing w:after="240" w:before="240" w:lineRule="auto"/>
+        <w:rPr/>
+      </w:pPr>
+      <w:r>
+        <w:rPr>
+          <w:rtl w:val="0"/>
+        </w:rPr>
+        <w:t xml:space="preserve">2. Hace clic en "Agregar nuevo material".</w:t>
+      </w:r>
+    </w:p>
+    <w:p>
+      <w:pPr>
+        <w:spacing w:after="240" w:before="240" w:lineRule="auto"/>
+        <w:rPr/>
+      </w:pPr>
+      <w:r>
+        <w:rPr>
+          <w:rtl w:val="0"/>
+        </w:rPr>
+        <w:t xml:space="preserve">3. El sistema despliega un formulario.</w:t>
+      </w:r>
+    </w:p>
+    <w:p>
+      <w:pPr>
+        <w:spacing w:after="240" w:before="240" w:lineRule="auto"/>
+        <w:rPr/>
+      </w:pPr>
+      <w:r>
+        <w:rPr>
+          <w:rtl w:val="0"/>
+        </w:rPr>
+        <w:t xml:space="preserve">4. El Administrador ingresa los campos correspondientes al material</w:t>
+      </w:r>
+    </w:p>
+    <w:p>
+      <w:pPr>
+        <w:spacing w:after="240" w:before="240" w:lineRule="auto"/>
+        <w:rPr/>
+      </w:pPr>
+      <w:r>
+        <w:rPr>
+          <w:rtl w:val="0"/>
+        </w:rPr>
+        <w:t xml:space="preserve">5. Selecciona la categoría a la que pertenece </w:t>
+      </w:r>
+    </w:p>
+    <w:p>
+      <w:pPr>
+        <w:spacing w:after="240" w:before="240" w:lineRule="auto"/>
+        <w:rPr/>
+      </w:pPr>
+      <w:r>
+        <w:rPr>
+          <w:rtl w:val="0"/>
+        </w:rPr>
+        <w:t xml:space="preserve">6. Hace clic en "Guardar".</w:t>
+      </w:r>
+    </w:p>
+    <w:p>
+      <w:pPr>
+        <w:spacing w:after="240" w:before="240" w:lineRule="auto"/>
+        <w:rPr/>
+      </w:pPr>
+      <w:r>
+        <w:rPr>
+          <w:rtl w:val="0"/>
+        </w:rPr>
+        <w:t xml:space="preserve">7. El sistema almacena la información en la tabla material y actualiza la vista del inventario.</w:t>
+      </w:r>
+    </w:p>
+    <w:p>
+      <w:pPr>
+        <w:rPr/>
+      </w:pPr>
+      <w:r>
+        <w:rPr>
+          <w:b w:val="1"/>
+          <w:bCs w:val="1"/>
+          <w:rtl w:val="0"/>
+        </w:rPr>
+        <w:t xml:space="preserve">Flujos Alternativos: </w:t>
+      </w:r>
+      <w:r>
+        <w:rPr>
+          <w:rtl w:val="0"/>
+        </w:rPr>
+        <w:t xml:space="preserve">En el paso 2, el usuario puede seleccionar un material existente, presionar "Editar", modificar los valores (ej: subir el precio unitario) y guardar los cambios.</w:t>
+      </w:r>
+    </w:p>
+    <w:p>
+      <w:pPr>
+        <w:rPr/>
+      </w:pPr>
+      <w:r>
+        <w:rPr>
+          <w:b w:val="1"/>
+          <w:bCs w:val="1"/>
+          <w:rtl w:val="0"/>
+        </w:rPr>
+        <w:t xml:space="preserve">Postcondiciones: </w:t>
+      </w:r>
+      <w:r>
+        <w:rPr>
+          <w:rtl w:val="0"/>
+        </w:rPr>
+        <w:t xml:space="preserve">El catálogo de materiales se actualiza, permitiendo que estos nuevos insumos sean cotizados por el chatbot o asignados a proyectos.</w:t>
+      </w:r>
+    </w:p>
+    <w:p>
+      <w:pPr>
+        <w:rPr/>
+      </w:pPr>
+      <w:r>
+        <w:rPr>
+          <w:rtl w:val="0"/>
+        </w:rPr>
+        <w:t xml:space="preserve">------------------------------------------------------------------------------------------------------------------------</w:t>
+      </w:r>
+    </w:p>
+    <w:p>
+      <w:pPr>
+        <w:rPr/>
+      </w:pPr>
+      <w:r>
+        <w:rPr>
+          <w:b w:val="1"/>
+          <w:bCs w:val="1"/>
+          <w:rtl w:val="0"/>
+        </w:rPr>
+        <w:t xml:space="preserve">Nombre del Caso de Uso: </w:t>
+      </w:r>
+      <w:r>
+        <w:rPr>
+          <w:rtl w:val="0"/>
+        </w:rPr>
+        <w:t xml:space="preserve">CU07: Actualizar estado de obra.</w:t>
+      </w:r>
+    </w:p>
+    <w:p>
+      <w:pPr>
+        <w:rPr/>
+      </w:pPr>
+      <w:r>
+        <w:rPr>
+          <w:b w:val="1"/>
+          <w:bCs w:val="1"/>
+          <w:rtl w:val="0"/>
+        </w:rPr>
+        <w:t xml:space="preserve">Actor Principal: </w:t>
+      </w:r>
+      <w:r>
+        <w:rPr>
+          <w:rtl w:val="0"/>
+        </w:rPr>
+        <w:t xml:space="preserve">Administrador / Técnico.</w:t>
+      </w:r>
+    </w:p>
+    <w:p>
+      <w:pPr>
+        <w:rPr/>
+      </w:pPr>
+      <w:r>
+        <w:rPr>
+          <w:b w:val="1"/>
+          <w:bCs w:val="1"/>
+          <w:rtl w:val="0"/>
+        </w:rPr>
+        <w:t xml:space="preserve">Actor Secundario: </w:t>
+      </w:r>
+      <w:r>
+        <w:rPr>
+          <w:rtl w:val="0"/>
+        </w:rPr>
+        <w:t xml:space="preserve">Sistema (Base de Datos).</w:t>
+      </w:r>
+    </w:p>
+    <w:p>
+      <w:pPr>
+        <w:rPr/>
+      </w:pPr>
+      <w:r>
+        <w:rPr>
+          <w:b w:val="1"/>
+          <w:bCs w:val="1"/>
+          <w:rtl w:val="0"/>
+        </w:rPr>
+        <w:t xml:space="preserve">Descripción: </w:t>
+      </w:r>
+      <w:r>
+        <w:rPr>
+          <w:rtl w:val="0"/>
+        </w:rPr>
+        <w:t xml:space="preserve">El usuario registra en la plataforma el progreso físico de los trabajos eléctricos, cambiando el estado del proyecto para mantener el historial ordenado.</w:t>
+      </w:r>
+    </w:p>
+    <w:p>
+      <w:pPr>
+        <w:rPr/>
+      </w:pPr>
+      <w:r>
+        <w:rPr>
+          <w:b w:val="1"/>
+          <w:bCs w:val="1"/>
+          <w:rtl w:val="0"/>
+        </w:rPr>
+        <w:t xml:space="preserve">Precondiciones: </w:t>
+      </w:r>
+      <w:r>
+        <w:rPr>
+          <w:rtl w:val="0"/>
+        </w:rPr>
+        <w:t xml:space="preserve">El proyecto debe existir y estar en estado "En curso".</w:t>
+      </w:r>
+    </w:p>
+    <w:p>
+      <w:pPr>
+        <w:rPr>
+          <w:b w:val="1"/>
+          <w:bCs w:val="1"/>
+        </w:rPr>
+      </w:pPr>
+      <w:r>
+        <w:rPr>
+          <w:b w:val="1"/>
+          <w:bCs w:val="1"/>
+          <w:rtl w:val="0"/>
+        </w:rPr>
+        <w:t xml:space="preserve">Flujo Principal</w:t>
+      </w:r>
+    </w:p>
+    <w:p>
+      <w:pPr>
+        <w:spacing w:after="240" w:before="240" w:lineRule="auto"/>
+        <w:rPr/>
+      </w:pPr>
+      <w:r>
+        <w:rPr>
+          <w:rtl w:val="0"/>
+        </w:rPr>
+        <w:t xml:space="preserve">1. El usuario entra al módulo de "Proyectos".</w:t>
+      </w:r>
+    </w:p>
+    <w:p>
+      <w:pPr>
+        <w:spacing w:after="240" w:before="240" w:lineRule="auto"/>
+        <w:rPr/>
+      </w:pPr>
+      <w:r>
+        <w:rPr>
+          <w:rtl w:val="0"/>
+        </w:rPr>
+        <w:t xml:space="preserve">2. Selecciona los estados </w:t>
+      </w:r>
+    </w:p>
+    <w:p>
+      <w:pPr>
+        <w:spacing w:after="240" w:before="240" w:lineRule="auto"/>
+        <w:rPr/>
+      </w:pPr>
+      <w:r>
+        <w:rPr>
+          <w:rtl w:val="0"/>
+        </w:rPr>
+        <w:t xml:space="preserve">3. Hace clic en el botón "Cambiar Estado".</w:t>
+      </w:r>
+    </w:p>
+    <w:p>
+      <w:pPr>
+        <w:spacing w:after="240" w:before="240" w:lineRule="auto"/>
+        <w:rPr/>
+      </w:pPr>
+      <w:r>
+        <w:rPr>
+          <w:rtl w:val="0"/>
+        </w:rPr>
+        <w:t xml:space="preserve">4. El sistema despliega las opciones disponibles </w:t>
+      </w:r>
+    </w:p>
+    <w:p>
+      <w:pPr>
+        <w:spacing w:after="240" w:before="240" w:lineRule="auto"/>
+        <w:rPr/>
+      </w:pPr>
+      <w:r>
+        <w:rPr>
+          <w:rtl w:val="0"/>
+        </w:rPr>
+        <w:t xml:space="preserve">5. El usuario selecciona "Finalizado" tras completar el trabajo en terreno.</w:t>
+      </w:r>
+    </w:p>
+    <w:p>
+      <w:pPr>
+        <w:spacing w:after="240" w:before="240" w:lineRule="auto"/>
+        <w:rPr/>
+      </w:pPr>
+      <w:r>
+        <w:rPr>
+          <w:rtl w:val="0"/>
+        </w:rPr>
+        <w:t xml:space="preserve">6. El sistema actualiza el atributo estado en la tabla proyecto y registra la fecha_termino.</w:t>
+      </w:r>
+    </w:p>
+    <w:p>
+      <w:pPr>
+        <w:rPr/>
+      </w:pPr>
+      <w:r>
+        <w:rPr>
+          <w:b w:val="1"/>
+          <w:bCs w:val="1"/>
+          <w:rtl w:val="0"/>
+        </w:rPr>
+        <w:t xml:space="preserve">Flujos Alternativos: </w:t>
+      </w:r>
+      <w:r>
+        <w:rPr>
+          <w:rtl w:val="0"/>
+        </w:rPr>
+        <w:t xml:space="preserve">En el paso 5</w:t>
+      </w:r>
+      <w:r>
+        <w:rPr>
+          <w:b w:val="1"/>
+          <w:bCs w:val="1"/>
+          <w:rtl w:val="0"/>
+        </w:rPr>
+        <w:t xml:space="preserve">,</w:t>
+      </w:r>
+      <w:r>
+        <w:rPr>
+          <w:rtl w:val="0"/>
+        </w:rPr>
+        <w:t xml:space="preserve"> si el cliente suspende la obra, el estado cambia a "Cancelado" y se liberan los materiales no utilizados de vuelta al inventario.</w:t>
+      </w:r>
+    </w:p>
+    <w:p>
+      <w:pPr>
+        <w:rPr/>
+      </w:pPr>
+      <w:r>
+        <w:rPr>
+          <w:b w:val="1"/>
+          <w:bCs w:val="1"/>
+          <w:rtl w:val="0"/>
+        </w:rPr>
+        <w:t xml:space="preserve">Postcondiciones: </w:t>
+      </w:r>
+      <w:r>
+        <w:rPr>
+          <w:rtl w:val="0"/>
+        </w:rPr>
+        <w:t xml:space="preserve">El proyecto sale de las tareas pendientes/activas y pasa al historial de obras terminadas. </w:t>
+      </w:r>
+      <w:r>
+        <w:rPr>
+          <w:rtl w:val="0"/>
+        </w:rPr>
+        <w:t xml:space="preserve">------------------------------------------------------------------------------------------------------------------------</w:t>
+      </w:r>
+    </w:p>
+    <w:p>
+      <w:pPr>
+        <w:rPr/>
+      </w:pPr>
+      <w:r>
+        <w:rPr>
+          <w:b w:val="1"/>
+          <w:bCs w:val="1"/>
+          <w:rtl w:val="0"/>
+        </w:rPr>
+        <w:t xml:space="preserve">Nombre del Caso de Uso: </w:t>
+      </w:r>
+      <w:r>
+        <w:rPr>
+          <w:rtl w:val="0"/>
+        </w:rPr>
+        <w:t xml:space="preserve">CU08: Generar Ficha Técnica de cierre.</w:t>
+      </w:r>
+    </w:p>
+    <w:p>
+      <w:pPr>
+        <w:rPr/>
+      </w:pPr>
+      <w:r>
+        <w:rPr>
+          <w:b w:val="1"/>
+          <w:bCs w:val="1"/>
+          <w:rtl w:val="0"/>
+        </w:rPr>
+        <w:t xml:space="preserve">Actor Principal: </w:t>
+      </w:r>
+      <w:r>
+        <w:rPr>
+          <w:rtl w:val="0"/>
+        </w:rPr>
+        <w:t xml:space="preserve">Administrador.</w:t>
+      </w:r>
+    </w:p>
+    <w:p>
+      <w:pPr>
+        <w:rPr/>
+      </w:pPr>
+      <w:r>
+        <w:rPr>
+          <w:b w:val="1"/>
+          <w:bCs w:val="1"/>
+          <w:rtl w:val="0"/>
+        </w:rPr>
+        <w:t xml:space="preserve">Actor Secundario: </w:t>
+      </w:r>
+      <w:r>
+        <w:rPr>
+          <w:rtl w:val="0"/>
+        </w:rPr>
+        <w:t xml:space="preserve">Sistema </w:t>
+      </w:r>
+    </w:p>
+    <w:p>
+      <w:pPr>
+        <w:rPr/>
+      </w:pPr>
+      <w:r>
+        <w:rPr>
+          <w:b w:val="1"/>
+          <w:bCs w:val="1"/>
+          <w:rtl w:val="0"/>
+        </w:rPr>
+        <w:t xml:space="preserve">Descripción: </w:t>
+      </w:r>
+      <w:r>
+        <w:rPr>
+          <w:rtl w:val="0"/>
+        </w:rPr>
+        <w:t xml:space="preserve">El sistema consolida la información del proyecto (cliente, categoría, presupuesto, observaciones y detalle de materiales reales consumidos) y genera un documento formal para respaldo y firma.</w:t>
+      </w:r>
+    </w:p>
+    <w:p>
+      <w:pPr>
+        <w:rPr/>
+      </w:pPr>
+      <w:r>
+        <w:rPr>
+          <w:b w:val="1"/>
+          <w:bCs w:val="1"/>
+          <w:rtl w:val="0"/>
+        </w:rPr>
+        <w:t xml:space="preserve">Precondiciones: </w:t>
+      </w:r>
+      <w:r>
+        <w:rPr>
+          <w:rtl w:val="0"/>
+        </w:rPr>
+        <w:t xml:space="preserve">El proyecto debe estar en estado "Finalizado" y deben haberse registrado los movimientos de materiales.</w:t>
+      </w:r>
+    </w:p>
+    <w:p>
+      <w:pPr>
+        <w:rPr>
+          <w:b w:val="1"/>
+          <w:bCs w:val="1"/>
+        </w:rPr>
+      </w:pPr>
+      <w:r>
+        <w:rPr>
+          <w:b w:val="1"/>
+          <w:bCs w:val="1"/>
+          <w:rtl w:val="0"/>
+        </w:rPr>
+        <w:t xml:space="preserve">Flujo Principal</w:t>
+      </w:r>
+    </w:p>
+    <w:p>
+      <w:pPr>
+        <w:spacing w:after="240" w:lineRule="auto"/>
+        <w:rPr/>
+      </w:pPr>
+      <w:r>
+        <w:rPr>
+          <w:rtl w:val="0"/>
+        </w:rPr>
+        <w:t xml:space="preserve">1. El administrador ingresa al detalle de un proyecto finalizado.</w:t>
+      </w:r>
+    </w:p>
+    <w:p>
+      <w:pPr>
+        <w:spacing w:after="240" w:lineRule="auto"/>
+        <w:rPr/>
+      </w:pPr>
+      <w:r>
+        <w:rPr>
+          <w:rtl w:val="0"/>
+        </w:rPr>
+        <w:t xml:space="preserve">2. Hace clic en el botón "Exportar Ficha Técnica".</w:t>
+      </w:r>
+    </w:p>
+    <w:p>
+      <w:pPr>
+        <w:spacing w:after="240" w:lineRule="auto"/>
+        <w:rPr/>
+      </w:pPr>
+      <w:r>
+        <w:rPr>
+          <w:rtl w:val="0"/>
+        </w:rPr>
+        <w:t xml:space="preserve">3. El sistema recopila los datos de las tablas proyecto, usuario (Admin a cargo), y suma los registros de la tabla movimiento asociados a ese proyecto.</w:t>
+      </w:r>
+    </w:p>
+    <w:p>
+      <w:pPr>
+        <w:spacing w:after="240" w:lineRule="auto"/>
+        <w:rPr/>
+      </w:pPr>
+      <w:r>
+        <w:rPr>
+          <w:rtl w:val="0"/>
+        </w:rPr>
+        <w:t xml:space="preserve">4. El sistema compara la cantidad sugerida por la plantilla vs la cantidad real utilizada, calculando ajustes y el costo final.</w:t>
+      </w:r>
+    </w:p>
+    <w:p>
+      <w:pPr>
+        <w:spacing w:after="240" w:lineRule="auto"/>
+        <w:rPr/>
+      </w:pPr>
+      <w:r>
+        <w:rPr>
+          <w:rtl w:val="0"/>
+        </w:rPr>
+        <w:t xml:space="preserve">5. Se genera un archivo PDF con formato institucional ("SERVI ELEC MANAGER - Ficha de Servicio Técnico").</w:t>
+      </w:r>
+    </w:p>
+    <w:p>
+      <w:pPr>
+        <w:spacing w:after="240" w:lineRule="auto"/>
+        <w:rPr/>
+      </w:pPr>
+      <w:r>
+        <w:rPr>
+          <w:rtl w:val="0"/>
+        </w:rPr>
+        <w:t xml:space="preserve">6. El administrador descarga el documento.</w:t>
+      </w:r>
+    </w:p>
+    <w:p>
+      <w:pPr>
+        <w:rPr/>
+      </w:pPr>
+      <w:r>
+        <w:rPr>
+          <w:b w:val="1"/>
+          <w:bCs w:val="1"/>
+          <w:rtl w:val="0"/>
+        </w:rPr>
+        <w:t xml:space="preserve">Flujos Alternativos: </w:t>
+      </w:r>
+      <w:r>
+        <w:rPr>
+          <w:rtl w:val="0"/>
+        </w:rPr>
+        <w:t xml:space="preserve">En el paso 3 si faltan datos críticos (como el registro de materiales), el sistema avisa que el reporte podría estar incompleto.</w:t>
+      </w:r>
+    </w:p>
+    <w:p>
+      <w:pPr>
+        <w:rPr/>
+      </w:pPr>
+      <w:r>
+        <w:rPr>
+          <w:b w:val="1"/>
+          <w:bCs w:val="1"/>
+          <w:rtl w:val="0"/>
+        </w:rPr>
+        <w:t xml:space="preserve">Postcondiciones: </w:t>
+      </w:r>
+      <w:r>
+        <w:rPr>
+          <w:rtl w:val="0"/>
+        </w:rPr>
+        <w:t xml:space="preserve">Se obtiene un documento digital estructurado con la certificación del trabajo y el detalle financiero real.</w:t>
+      </w:r>
+    </w:p>
+    <w:p>
+      <w:pPr>
+        <w:rPr/>
+      </w:pPr>
+      <w:r>
+        <w:rPr>
+          <w:rtl w:val="0"/>
+        </w:rPr>
+      </w:r>
+    </w:p>
+    <w:p>
+      <w:pPr>
+        <w:rPr>
+          <w:b w:val="1"/>
+          <w:bCs w:val="1"/>
+          <w:u w:val="single"/>
+        </w:rPr>
+      </w:pPr>
+      <w:r>
+        <w:rPr>
+          <w:rtl w:val="0"/>
+        </w:rPr>
+      </w:r>
+    </w:p>
+    <w:p>
+      <w:pPr>
+        <w:rPr>
+          <w:b w:val="1"/>
+          <w:bCs w:val="1"/>
+          <w:u w:val="single"/>
+        </w:rPr>
+      </w:pPr>
+      <w:r>
+        <w:rPr>
+          <w:rtl w:val="0"/>
+        </w:rPr>
+      </w:r>
+    </w:p>
+    <w:p>
+      <w:pPr>
+        <w:rPr>
+          <w:b w:val="1"/>
+          <w:bCs w:val="1"/>
+          <w:u w:val="single"/>
+        </w:rPr>
+      </w:pPr>
+      <w:r>
+        <w:rPr>
+          <w:rtl w:val="0"/>
+        </w:rPr>
+      </w:r>
+    </w:p>
+    <w:p>
+      <w:pPr>
+        <w:rPr>
+          <w:b w:val="1"/>
+          <w:bCs w:val="1"/>
+          <w:u w:val="single"/>
+        </w:rPr>
+      </w:pPr>
+      <w:r>
+        <w:rPr>
+          <w:rtl w:val="0"/>
+        </w:rPr>
+      </w:r>
+    </w:p>
+    <w:p>
+      <w:pPr>
+        <w:rPr>
+          <w:b w:val="1"/>
+          <w:bCs w:val="1"/>
+          <w:u w:val="single"/>
+        </w:rPr>
+      </w:pPr>
+      <w:r>
+        <w:rPr>
+          <w:rtl w:val="0"/>
+        </w:rPr>
+      </w:r>
+    </w:p>
+    <w:p>
+      <w:pPr>
+        <w:rPr>
+          <w:b w:val="1"/>
+          <w:bCs w:val="1"/>
+          <w:u w:val="single"/>
+        </w:rPr>
+      </w:pPr>
+      <w:r>
+        <w:rPr>
+          <w:rtl w:val="0"/>
+        </w:rPr>
+      </w:r>
+    </w:p>
+    <w:p>
+      <w:pPr>
+        <w:rPr>
+          <w:b w:val="1"/>
+          <w:bCs w:val="1"/>
+          <w:u w:val="single"/>
+        </w:rPr>
+      </w:pPr>
+      <w:r>
+        <w:rPr>
+          <w:rtl w:val="0"/>
+        </w:rPr>
+      </w:r>
+    </w:p>
+    <w:p>
+      <w:pPr>
+        <w:rPr>
+          <w:b w:val="1"/>
+          <w:bCs w:val="1"/>
+          <w:u w:val="single"/>
+        </w:rPr>
+      </w:pPr>
+      <w:r>
+        <w:rPr>
+          <w:rtl w:val="0"/>
+        </w:rPr>
+      </w:r>
+    </w:p>
+    <w:p>
+      <w:pPr>
+        <w:rPr>
+          <w:b w:val="1"/>
+          <w:bCs w:val="1"/>
+          <w:u w:val="single"/>
+        </w:rPr>
+      </w:pPr>
+      <w:r>
+        <w:rPr>
+          <w:rtl w:val="0"/>
+        </w:rPr>
+      </w:r>
+    </w:p>
+    <w:p>
+      <w:pPr>
+        <w:rPr>
+          <w:b w:val="1"/>
+          <w:bCs w:val="1"/>
+          <w:u w:val="single"/>
+        </w:rPr>
+      </w:pPr>
+      <w:r>
+        <w:rPr>
+          <w:rtl w:val="0"/>
+        </w:rPr>
+      </w:r>
+    </w:p>
+    <w:p>
+      <w:pPr>
+        <w:rPr>
+          <w:b w:val="1"/>
+          <w:bCs w:val="1"/>
+          <w:u w:val="single"/>
+        </w:rPr>
+      </w:pPr>
+      <w:r>
+        <w:rPr>
+          <w:rtl w:val="0"/>
+        </w:rPr>
+      </w:r>
+    </w:p>
+    <w:p>
+      <w:pPr>
+        <w:rPr>
+          <w:b w:val="1"/>
+          <w:bCs w:val="1"/>
+          <w:u w:val="single"/>
+        </w:rPr>
+      </w:pPr>
+      <w:r>
+        <w:rPr>
+          <w:rtl w:val="0"/>
+        </w:rPr>
+      </w:r>
+    </w:p>
+    <w:p>
+      <w:pPr>
+        <w:rPr>
+          <w:b w:val="1"/>
+          <w:bCs w:val="1"/>
+          <w:u w:val="single"/>
+        </w:rPr>
+      </w:pPr>
+      <w:r>
+        <w:rPr>
+          <w:rtl w:val="0"/>
+        </w:rPr>
+      </w:r>
+    </w:p>
+    <w:p>
+      <w:pPr>
+        <w:rPr>
+          <w:b w:val="1"/>
+          <w:bCs w:val="1"/>
+          <w:u w:val="single"/>
+        </w:rPr>
+      </w:pPr>
+      <w:r>
+        <w:rPr>
+          <w:rtl w:val="0"/>
+        </w:rPr>
+      </w:r>
+    </w:p>
+    <w:p>
+      <w:pPr>
+        <w:rPr>
+          <w:b w:val="1"/>
+          <w:bCs w:val="1"/>
+          <w:u w:val="single"/>
+        </w:rPr>
+      </w:pPr>
+      <w:r>
+        <w:rPr>
+          <w:rtl w:val="0"/>
+        </w:rPr>
+      </w:r>
+    </w:p>
+    <w:p>
+      <w:pPr>
+        <w:rPr>
+          <w:b w:val="1"/>
+          <w:bCs w:val="1"/>
+          <w:u w:val="single"/>
+        </w:rPr>
+      </w:pPr>
+      <w:r>
+        <w:rPr>
+          <w:rtl w:val="0"/>
+        </w:rPr>
+      </w:r>
+    </w:p>
+    <w:p>
+      <w:pPr>
+        <w:rPr>
+          <w:b w:val="1"/>
+          <w:bCs w:val="1"/>
+          <w:u w:val="single"/>
+        </w:rPr>
+      </w:pPr>
+      <w:r>
+        <w:rPr>
+          <w:rtl w:val="0"/>
+        </w:rPr>
+      </w:r>
+    </w:p>
+    <w:p>
+      <w:pPr>
+        <w:rPr>
+          <w:b w:val="1"/>
+          <w:bCs w:val="1"/>
+          <w:u w:val="single"/>
+        </w:rPr>
+      </w:pPr>
+      <w:r>
+        <w:rPr>
+          <w:b w:val="1"/>
+          <w:bCs w:val="1"/>
+          <w:u w:val="single"/>
+          <w:rtl w:val="0"/>
+        </w:rPr>
+        <w:t xml:space="preserve">CASOS DE USO</w:t>
+      </w:r>
+    </w:p>
+    <w:p>
+      <w:pPr>
+        <w:rPr>
+          <w:b w:val="1"/>
+          <w:bCs w:val="1"/>
+          <w:u w:val="single"/>
+        </w:rPr>
+      </w:pPr>
+      <w:r>
+        <w:rPr>
+          <w:rtl w:val="0"/>
+        </w:rPr>
+      </w:r>
+    </w:p>
+    <w:p>
+      <w:pPr>
+        <w:rPr>
+          <w:b w:val="1"/>
+          <w:bCs w:val="1"/>
+          <w:u w:val="single"/>
+        </w:rPr>
+      </w:pPr>
+      <w:r>
+        <w:rPr>
+          <w:b w:val="1"/>
+          <w:bCs w:val="1"/>
+          <w:u w:val="single"/>
+        </w:rPr>
+        <w:drawing>
+          <wp:inline distB="114300" distT="114300" distL="114300" distR="114300">
+            <wp:extent cx="5731200" cy="5384800"/>
+            <wp:effectExtent b="0" l="0" r="0" t="0"/>
+            <wp:docPr id="14" name="image15.png"/>
+            <a:graphic>
+              <a:graphicData uri="http://schemas.openxmlformats.org/drawingml/2006/picture">
+                <pic:pic>
+                  <pic:nvPicPr>
+                    <pic:cNvPr id="0" name="image15.png"/>
+                    <pic:cNvPicPr preferRelativeResize="0"/>
+                  </pic:nvPicPr>
+                  <pic:blipFill>
+                    <a:blip r:embed="rId8"/>
+                    <a:srcRect b="0" l="0" r="0" t="0"/>
+                    <a:stretch>
+                      <a:fillRect/>
+                    </a:stretch>
+                  </pic:blipFill>
+                  <pic:spPr>
+                    <a:xfrm>
+                      <a:off x="0" y="0"/>
+                      <a:ext cx="5731200" cy="5384800"/>
+                    </a:xfrm>
+                    <a:prstGeom prst="rect"/>
+                    <a:ln/>
+                  </pic:spPr>
+                </pic:pic>
+              </a:graphicData>
+            </a:graphic>
+          </wp:inline>
+        </w:drawing>
+      </w:r>
+      <w:r>
+        <w:rPr>
+          <w:rtl w:val="0"/>
+        </w:rPr>
+      </w:r>
+    </w:p>
+    <w:p>
+      <w:pPr>
+        <w:rPr>
+          <w:b w:val="1"/>
+          <w:bCs w:val="1"/>
+          <w:u w:val="single"/>
+        </w:rPr>
+      </w:pPr>
+      <w:r>
+        <w:rPr>
+          <w:rtl w:val="0"/>
+        </w:rPr>
+      </w:r>
+    </w:p>
+    <w:p>
+      <w:pPr>
+        <w:rPr>
+          <w:b w:val="1"/>
+          <w:bCs w:val="1"/>
+          <w:u w:val="single"/>
+        </w:rPr>
+      </w:pPr>
+      <w:r>
+        <w:rPr>
+          <w:rtl w:val="0"/>
+        </w:rPr>
+      </w:r>
+    </w:p>
+    <w:p>
+      <w:pPr>
+        <w:rPr>
+          <w:b w:val="1"/>
+          <w:bCs w:val="1"/>
+          <w:u w:val="single"/>
+        </w:rPr>
+      </w:pPr>
+      <w:r>
+        <w:rPr>
+          <w:rtl w:val="0"/>
+        </w:rPr>
+      </w:r>
+    </w:p>
+    <w:p>
+      <w:pPr>
+        <w:rPr>
+          <w:b w:val="1"/>
+          <w:bCs w:val="1"/>
+          <w:u w:val="single"/>
+        </w:rPr>
+      </w:pPr>
+      <w:r>
+        <w:rPr>
+          <w:rtl w:val="0"/>
+        </w:rPr>
+      </w:r>
+    </w:p>
+    <w:p>
+      <w:pPr>
+        <w:rPr>
+          <w:b w:val="1"/>
+          <w:bCs w:val="1"/>
+          <w:u w:val="single"/>
+        </w:rPr>
+      </w:pPr>
+      <w:r>
+        <w:rPr>
+          <w:rtl w:val="0"/>
+        </w:rPr>
+      </w:r>
+    </w:p>
+    <w:p>
+      <w:pPr>
+        <w:rPr>
+          <w:b w:val="1"/>
+          <w:bCs w:val="1"/>
+          <w:u w:val="single"/>
+        </w:rPr>
+      </w:pPr>
+      <w:r>
+        <w:rPr>
+          <w:rtl w:val="0"/>
+        </w:rPr>
+      </w:r>
+    </w:p>
+    <w:p>
+      <w:pPr>
+        <w:rPr>
+          <w:b w:val="1"/>
+          <w:bCs w:val="1"/>
+          <w:u w:val="single"/>
+        </w:rPr>
+      </w:pPr>
+      <w:r>
+        <w:rPr>
+          <w:rtl w:val="0"/>
+        </w:rPr>
+      </w:r>
+    </w:p>
+    <w:p>
+      <w:pPr>
+        <w:rPr>
+          <w:b w:val="1"/>
+          <w:bCs w:val="1"/>
+          <w:u w:val="single"/>
+        </w:rPr>
+      </w:pPr>
+      <w:r>
+        <w:rPr>
+          <w:rtl w:val="0"/>
+        </w:rPr>
+      </w:r>
+    </w:p>
+    <w:p>
+      <w:pPr>
+        <w:rPr>
+          <w:b w:val="1"/>
+          <w:bCs w:val="1"/>
+          <w:u w:val="single"/>
+        </w:rPr>
+      </w:pPr>
+      <w:r>
+        <w:rPr>
+          <w:rtl w:val="0"/>
+        </w:rPr>
+      </w:r>
+    </w:p>
+    <w:p>
+      <w:pPr>
+        <w:rPr>
+          <w:b w:val="1"/>
+          <w:bCs w:val="1"/>
+          <w:u w:val="single"/>
+        </w:rPr>
+      </w:pPr>
+      <w:r>
+        <w:rPr>
+          <w:rtl w:val="0"/>
+        </w:rPr>
+      </w:r>
+    </w:p>
+    <w:p>
+      <w:pPr>
+        <w:rPr>
+          <w:b w:val="1"/>
+          <w:bCs w:val="1"/>
+          <w:u w:val="single"/>
+        </w:rPr>
+      </w:pPr>
+      <w:r>
+        <w:rPr>
+          <w:rtl w:val="0"/>
+        </w:rPr>
+      </w:r>
+    </w:p>
+    <w:p>
+      <w:pPr>
+        <w:rPr>
+          <w:b w:val="1"/>
+          <w:bCs w:val="1"/>
+          <w:u w:val="single"/>
+        </w:rPr>
+      </w:pPr>
+      <w:r>
+        <w:rPr>
+          <w:rtl w:val="0"/>
+        </w:rPr>
+      </w:r>
+    </w:p>
+    <w:p>
+      <w:pPr>
+        <w:rPr>
+          <w:b w:val="1"/>
+          <w:bCs w:val="1"/>
+          <w:u w:val="single"/>
+        </w:rPr>
+      </w:pPr>
+      <w:r>
+        <w:rPr>
+          <w:rtl w:val="0"/>
+        </w:rPr>
+      </w:r>
+    </w:p>
+    <w:p>
+      <w:pPr>
+        <w:rPr>
+          <w:b w:val="1"/>
+          <w:bCs w:val="1"/>
+          <w:u w:val="single"/>
+        </w:rPr>
+      </w:pPr>
+      <w:r>
+        <w:rPr>
+          <w:rtl w:val="0"/>
+        </w:rPr>
+      </w:r>
+    </w:p>
+    <w:p>
+      <w:pPr>
+        <w:rPr>
+          <w:b w:val="1"/>
+          <w:bCs w:val="1"/>
+          <w:u w:val="single"/>
+        </w:rPr>
+      </w:pPr>
+      <w:r>
+        <w:rPr>
+          <w:rtl w:val="0"/>
+        </w:rPr>
+      </w:r>
+    </w:p>
+    <w:p>
+      <w:pPr>
+        <w:rPr>
+          <w:b w:val="1"/>
+          <w:bCs w:val="1"/>
+          <w:u w:val="single"/>
+        </w:rPr>
+      </w:pPr>
+      <w:r>
+        <w:rPr>
+          <w:rtl w:val="0"/>
+        </w:rPr>
+      </w:r>
+    </w:p>
+    <w:p>
+      <w:pPr>
+        <w:rPr>
+          <w:b w:val="1"/>
+          <w:bCs w:val="1"/>
+          <w:u w:val="single"/>
+        </w:rPr>
+      </w:pPr>
+      <w:r>
+        <w:rPr>
+          <w:b w:val="1"/>
+          <w:bCs w:val="1"/>
+          <w:u w:val="single"/>
+          <w:rtl w:val="0"/>
+        </w:rPr>
+        <w:t xml:space="preserve">DIAGRAMAS DE FLUJO</w:t>
+      </w:r>
+    </w:p>
+    <w:p>
+      <w:pPr>
+        <w:rPr>
+          <w:b w:val="1"/>
+          <w:bCs w:val="1"/>
+          <w:u w:val="single"/>
+        </w:rPr>
+      </w:pPr>
+      <w:r>
+        <w:rPr>
+          <w:rtl w:val="0"/>
+        </w:rPr>
+      </w:r>
+    </w:p>
+    <w:p>
+      <w:pPr>
+        <w:rPr>
+          <w:b w:val="1"/>
+          <w:bCs w:val="1"/>
+          <w:u w:val="single"/>
+        </w:rPr>
+      </w:pPr>
+      <w:r>
+        <w:rPr>
+          <w:b w:val="1"/>
+          <w:bCs w:val="1"/>
+          <w:u w:val="single"/>
+          <w:rtl w:val="0"/>
+        </w:rPr>
+        <w:t xml:space="preserve">Flujo del chatbot</w:t>
+      </w:r>
+    </w:p>
+    <w:p>
+      <w:pPr>
+        <w:rPr>
+          <w:b w:val="1"/>
+          <w:bCs w:val="1"/>
+          <w:u w:val="single"/>
+        </w:rPr>
+      </w:pPr>
+      <w:r>
+        <w:rPr>
+          <w:b w:val="1"/>
+          <w:bCs w:val="1"/>
+          <w:u w:val="single"/>
+        </w:rPr>
+        <w:drawing>
+          <wp:inline distB="114300" distT="114300" distL="114300" distR="114300">
+            <wp:extent cx="5729288" cy="8076225"/>
+            <wp:effectExtent b="0" l="0" r="0" t="0"/>
+            <wp:docPr id="22" name="image21.png"/>
+            <a:graphic>
+              <a:graphicData uri="http://schemas.openxmlformats.org/drawingml/2006/picture">
+                <pic:pic>
+                  <pic:nvPicPr>
+                    <pic:cNvPr id="0" name="image21.png"/>
+                    <pic:cNvPicPr preferRelativeResize="0"/>
+                  </pic:nvPicPr>
+                  <pic:blipFill>
+                    <a:blip r:embed="rId9"/>
+                    <a:srcRect b="0" l="0" r="0" t="0"/>
+                    <a:stretch>
+                      <a:fillRect/>
+                    </a:stretch>
+                  </pic:blipFill>
+                  <pic:spPr>
+                    <a:xfrm>
+                      <a:off x="0" y="0"/>
+                      <a:ext cx="5729288" cy="8076225"/>
+                    </a:xfrm>
+                    <a:prstGeom prst="rect"/>
+                    <a:ln/>
+                  </pic:spPr>
+                </pic:pic>
+              </a:graphicData>
+            </a:graphic>
+          </wp:inline>
+        </w:drawing>
+      </w:r>
+      <w:r>
+        <w:rPr>
+          <w:rtl w:val="0"/>
+        </w:rPr>
+      </w:r>
+    </w:p>
+    <w:p>
+      <w:pPr>
+        <w:rPr>
+          <w:b w:val="1"/>
+          <w:bCs w:val="1"/>
+          <w:u w:val="single"/>
+        </w:rPr>
+      </w:pPr>
+      <w:r>
+        <w:rPr>
+          <w:b w:val="1"/>
+          <w:bCs w:val="1"/>
+          <w:u w:val="single"/>
+          <w:rtl w:val="0"/>
+        </w:rPr>
+        <w:t xml:space="preserve">Flujo de gestión de proyecto</w:t>
+      </w:r>
+    </w:p>
+    <w:p>
+      <w:pPr>
+        <w:rPr>
+          <w:b w:val="1"/>
+          <w:bCs w:val="1"/>
+          <w:u w:val="single"/>
+        </w:rPr>
+      </w:pPr>
+      <w:r>
+        <w:rPr>
+          <w:b w:val="1"/>
+          <w:bCs w:val="1"/>
+          <w:u w:val="single"/>
+        </w:rPr>
+        <w:drawing>
+          <wp:inline distB="114300" distT="114300" distL="114300" distR="114300">
+            <wp:extent cx="5266899" cy="8215313"/>
+            <wp:effectExtent b="0" l="0" r="0" t="0"/>
+            <wp:docPr id="3" name="image8.png"/>
+            <a:graphic>
+              <a:graphicData uri="http://schemas.openxmlformats.org/drawingml/2006/picture">
+                <pic:pic>
+                  <pic:nvPicPr>
+                    <pic:cNvPr id="0" name="image8.png"/>
+                    <pic:cNvPicPr preferRelativeResize="0"/>
+                  </pic:nvPicPr>
+                  <pic:blipFill>
+                    <a:blip r:embed="rId10"/>
+                    <a:srcRect b="0" l="0" r="0" t="0"/>
+                    <a:stretch>
+                      <a:fillRect/>
+                    </a:stretch>
+                  </pic:blipFill>
+                  <pic:spPr>
+                    <a:xfrm>
+                      <a:off x="0" y="0"/>
+                      <a:ext cx="5266899" cy="8215313"/>
+                    </a:xfrm>
+                    <a:prstGeom prst="rect"/>
+                    <a:ln/>
+                  </pic:spPr>
+                </pic:pic>
+              </a:graphicData>
+            </a:graphic>
+          </wp:inline>
+        </w:drawing>
+      </w:r>
+      <w:r>
+        <w:rPr>
+          <w:rtl w:val="0"/>
+        </w:rPr>
+      </w:r>
+    </w:p>
+    <w:p>
+      <w:pPr>
+        <w:rPr>
+          <w:b w:val="1"/>
+          <w:bCs w:val="1"/>
+          <w:u w:val="single"/>
+        </w:rPr>
+      </w:pPr>
+      <w:r>
+        <w:rPr>
+          <w:rtl w:val="0"/>
+        </w:rPr>
+      </w:r>
+    </w:p>
+    <w:p>
+      <w:pPr>
+        <w:rPr>
+          <w:b w:val="1"/>
+          <w:bCs w:val="1"/>
+          <w:u w:val="single"/>
+        </w:rPr>
+      </w:pPr>
+      <w:r>
+        <w:rPr>
+          <w:rtl w:val="0"/>
+        </w:rPr>
+      </w:r>
+    </w:p>
+    <w:p>
+      <w:pPr>
+        <w:rPr>
+          <w:b w:val="1"/>
+          <w:bCs w:val="1"/>
+          <w:u w:val="single"/>
+        </w:rPr>
+      </w:pPr>
+      <w:r>
+        <w:rPr>
+          <w:b w:val="1"/>
+          <w:bCs w:val="1"/>
+          <w:u w:val="single"/>
+          <w:rtl w:val="0"/>
+        </w:rPr>
+        <w:t xml:space="preserve">Flujo de inventario</w:t>
+      </w:r>
+    </w:p>
+    <w:p>
+      <w:pPr>
+        <w:rPr>
+          <w:b w:val="1"/>
+          <w:bCs w:val="1"/>
+          <w:u w:val="single"/>
+        </w:rPr>
+      </w:pPr>
+      <w:r>
+        <w:rPr>
+          <w:rtl w:val="0"/>
+        </w:rPr>
+      </w:r>
+    </w:p>
+    <w:p>
+      <w:pPr>
+        <w:rPr>
+          <w:b w:val="1"/>
+          <w:bCs w:val="1"/>
+          <w:u w:val="single"/>
+        </w:rPr>
+      </w:pPr>
+      <w:r>
+        <w:rPr>
+          <w:b w:val="1"/>
+          <w:bCs w:val="1"/>
+          <w:u w:val="single"/>
+        </w:rPr>
+        <w:drawing>
+          <wp:inline distB="114300" distT="114300" distL="114300" distR="114300">
+            <wp:extent cx="5381905" cy="8224838"/>
+            <wp:effectExtent b="0" l="0" r="0" t="0"/>
+            <wp:docPr id="10" name="image23.png"/>
+            <a:graphic>
+              <a:graphicData uri="http://schemas.openxmlformats.org/drawingml/2006/picture">
+                <pic:pic>
+                  <pic:nvPicPr>
+                    <pic:cNvPr id="0" name="image23.png"/>
+                    <pic:cNvPicPr preferRelativeResize="0"/>
+                  </pic:nvPicPr>
+                  <pic:blipFill>
+                    <a:blip r:embed="rId11"/>
+                    <a:srcRect b="0" l="0" r="0" t="0"/>
+                    <a:stretch>
+                      <a:fillRect/>
+                    </a:stretch>
+                  </pic:blipFill>
+                  <pic:spPr>
+                    <a:xfrm>
+                      <a:off x="0" y="0"/>
+                      <a:ext cx="5381905" cy="8224838"/>
+                    </a:xfrm>
+                    <a:prstGeom prst="rect"/>
+                    <a:ln/>
+                  </pic:spPr>
+                </pic:pic>
+              </a:graphicData>
+            </a:graphic>
+          </wp:inline>
+        </w:drawing>
+      </w:r>
+      <w:r>
+        <w:rPr>
+          <w:rtl w:val="0"/>
+        </w:rPr>
+      </w:r>
+    </w:p>
+    <w:p>
+      <w:pPr>
+        <w:rPr>
+          <w:b w:val="1"/>
+          <w:bCs w:val="1"/>
+          <w:u w:val="single"/>
+        </w:rPr>
+      </w:pPr>
+      <w:r>
+        <w:rPr>
+          <w:rtl w:val="0"/>
+        </w:rPr>
+      </w:r>
+    </w:p>
+    <w:p>
+      <w:pPr>
+        <w:rPr>
+          <w:b w:val="1"/>
+          <w:bCs w:val="1"/>
+          <w:u w:val="single"/>
+        </w:rPr>
+      </w:pPr>
+      <w:r>
+        <w:rPr>
+          <w:b w:val="1"/>
+          <w:bCs w:val="1"/>
+          <w:u w:val="single"/>
+          <w:rtl w:val="0"/>
+        </w:rPr>
+        <w:t xml:space="preserve">Flujo de comparador de precios</w:t>
+      </w:r>
+    </w:p>
+    <w:p>
+      <w:pPr>
+        <w:rPr>
+          <w:b w:val="1"/>
+          <w:bCs w:val="1"/>
+          <w:u w:val="single"/>
+        </w:rPr>
+      </w:pPr>
+      <w:r>
+        <w:rPr>
+          <w:b w:val="1"/>
+          <w:bCs w:val="1"/>
+          <w:u w:val="single"/>
+        </w:rPr>
+        <w:drawing>
+          <wp:inline distB="114300" distT="114300" distL="114300" distR="114300">
+            <wp:extent cx="5731200" cy="7823200"/>
+            <wp:effectExtent b="0" l="0" r="0" t="0"/>
+            <wp:docPr id="23" name="image20.png"/>
+            <a:graphic>
+              <a:graphicData uri="http://schemas.openxmlformats.org/drawingml/2006/picture">
+                <pic:pic>
+                  <pic:nvPicPr>
+                    <pic:cNvPr id="0" name="image20.png"/>
+                    <pic:cNvPicPr preferRelativeResize="0"/>
+                  </pic:nvPicPr>
+                  <pic:blipFill>
+                    <a:blip r:embed="rId12"/>
+                    <a:srcRect b="0" l="0" r="0" t="0"/>
+                    <a:stretch>
+                      <a:fillRect/>
+                    </a:stretch>
+                  </pic:blipFill>
+                  <pic:spPr>
+                    <a:xfrm>
+                      <a:off x="0" y="0"/>
+                      <a:ext cx="5731200" cy="7823200"/>
+                    </a:xfrm>
+                    <a:prstGeom prst="rect"/>
+                    <a:ln/>
+                  </pic:spPr>
+                </pic:pic>
+              </a:graphicData>
+            </a:graphic>
+          </wp:inline>
+        </w:drawing>
+      </w:r>
+      <w:r>
+        <w:rPr>
+          <w:rtl w:val="0"/>
+        </w:rPr>
+      </w:r>
+    </w:p>
+    <w:p>
+      <w:pPr>
+        <w:rPr>
+          <w:b w:val="1"/>
+          <w:bCs w:val="1"/>
+          <w:u w:val="single"/>
+        </w:rPr>
+      </w:pPr>
+      <w:r>
+        <w:rPr>
+          <w:rtl w:val="0"/>
+        </w:rPr>
+      </w:r>
+    </w:p>
+    <w:p>
+      <w:pPr>
+        <w:rPr>
+          <w:b w:val="1"/>
+          <w:bCs w:val="1"/>
+          <w:u w:val="single"/>
+        </w:rPr>
+      </w:pPr>
+      <w:r>
+        <w:rPr>
+          <w:rtl w:val="0"/>
+        </w:rPr>
+      </w:r>
+    </w:p>
+    <w:p>
+      <w:pPr>
+        <w:rPr>
+          <w:b w:val="1"/>
+          <w:bCs w:val="1"/>
+          <w:u w:val="single"/>
+        </w:rPr>
+      </w:pPr>
+      <w:r>
+        <w:rPr>
+          <w:rtl w:val="0"/>
+        </w:rPr>
+      </w:r>
+    </w:p>
+    <w:p>
+      <w:pPr>
+        <w:rPr>
+          <w:b w:val="1"/>
+          <w:bCs w:val="1"/>
+          <w:u w:val="single"/>
+        </w:rPr>
+      </w:pPr>
+      <w:r>
+        <w:rPr>
+          <w:rtl w:val="0"/>
+        </w:rPr>
+      </w:r>
+    </w:p>
+    <w:p>
+      <w:pPr>
+        <w:rPr>
+          <w:b w:val="1"/>
+          <w:bCs w:val="1"/>
+          <w:u w:val="single"/>
+        </w:rPr>
+      </w:pPr>
+      <w:r>
+        <w:rPr>
+          <w:b w:val="1"/>
+          <w:bCs w:val="1"/>
+          <w:u w:val="single"/>
+          <w:rtl w:val="0"/>
+        </w:rPr>
         <w:t xml:space="preserve">DIAGRAMA UML - ESTADOS</w:t>
       </w:r>
     </w:p>
@@ -660,16 +4161,16 @@
           <wp:inline distB="114300" distT="114300" distL="114300" distR="114300">
             <wp:extent cx="5731200" cy="7378700"/>
             <wp:effectExtent b="0" l="0" r="0" t="0"/>
-            <wp:docPr id="7" name="image6.png"/>
+            <wp:docPr id="11" name="image22.png"/>
             <a:graphic>
               <a:graphicData uri="http://schemas.openxmlformats.org/drawingml/2006/picture">
                 <pic:pic>
                   <pic:nvPicPr>
-                    <pic:cNvPr id="0" name="image6.png"/>
+                    <pic:cNvPr id="0" name="image22.png"/>
                     <pic:cNvPicPr preferRelativeResize="0"/>
                   </pic:nvPicPr>
                   <pic:blipFill>
-                    <a:blip r:embed="rId7"/>
+                    <a:blip r:embed="rId13"/>
                     <a:srcRect b="0" l="0" r="0" t="0"/>
                     <a:stretch>
                       <a:fillRect/>
@@ -811,16 +4312,16 @@
           <wp:inline distB="114300" distT="114300" distL="114300" distR="114300">
             <wp:extent cx="6210519" cy="7344775"/>
             <wp:effectExtent b="0" l="0" r="0" t="0"/>
-            <wp:docPr id="4" name="image7.png"/>
+            <wp:docPr id="6" name="image14.png"/>
             <a:graphic>
               <a:graphicData uri="http://schemas.openxmlformats.org/drawingml/2006/picture">
                 <pic:pic>
                   <pic:nvPicPr>
-                    <pic:cNvPr id="0" name="image7.png"/>
+                    <pic:cNvPr id="0" name="image14.png"/>
                     <pic:cNvPicPr preferRelativeResize="0"/>
                   </pic:nvPicPr>
                   <pic:blipFill>
-                    <a:blip r:embed="rId8"/>
+                    <a:blip r:embed="rId14"/>
                     <a:srcRect b="0" l="0" r="0" t="0"/>
                     <a:stretch>
                       <a:fillRect/>
@@ -925,16 +4426,16 @@
           <wp:inline distB="114300" distT="114300" distL="114300" distR="114300">
             <wp:extent cx="5731200" cy="2997200"/>
             <wp:effectExtent b="0" l="0" r="0" t="0"/>
-            <wp:docPr id="3" name="image4.png"/>
+            <wp:docPr id="2" name="image12.png"/>
             <a:graphic>
               <a:graphicData uri="http://schemas.openxmlformats.org/drawingml/2006/picture">
                 <pic:pic>
                   <pic:nvPicPr>
-                    <pic:cNvPr id="0" name="image4.png"/>
+                    <pic:cNvPr id="0" name="image12.png"/>
                     <pic:cNvPicPr preferRelativeResize="0"/>
                   </pic:nvPicPr>
                   <pic:blipFill>
-                    <a:blip r:embed="rId9"/>
+                    <a:blip r:embed="rId15"/>
                     <a:srcRect b="0" l="0" r="0" t="0"/>
                     <a:stretch>
                       <a:fillRect/>
@@ -976,6 +4477,105 @@
     </w:p>
     <w:p>
       <w:pPr>
+        <w:rPr>
+          <w:b w:val="1"/>
+          <w:bCs w:val="1"/>
+          <w:u w:val="single"/>
+        </w:rPr>
+      </w:pPr>
+      <w:r>
+        <w:rPr>
+          <w:rtl w:val="0"/>
+        </w:rPr>
+      </w:r>
+    </w:p>
+    <w:p>
+      <w:pPr>
+        <w:rPr>
+          <w:b w:val="1"/>
+          <w:bCs w:val="1"/>
+          <w:u w:val="single"/>
+        </w:rPr>
+      </w:pPr>
+      <w:r>
+        <w:rPr>
+          <w:b w:val="1"/>
+          <w:bCs w:val="1"/>
+          <w:u w:val="single"/>
+          <w:rtl w:val="0"/>
+        </w:rPr>
+        <w:t xml:space="preserve">ARQUITECTURA GENERAL DE SOFTWARE</w:t>
+      </w:r>
+    </w:p>
+    <w:p>
+      <w:pPr>
+        <w:rPr>
+          <w:b w:val="1"/>
+          <w:bCs w:val="1"/>
+          <w:u w:val="single"/>
+        </w:rPr>
+      </w:pPr>
+      <w:r>
+        <w:rPr>
+          <w:b w:val="1"/>
+          <w:bCs w:val="1"/>
+          <w:u w:val="single"/>
+        </w:rPr>
+        <w:drawing>
+          <wp:inline distB="114300" distT="114300" distL="114300" distR="114300">
+            <wp:extent cx="5338763" cy="4584951"/>
+            <wp:effectExtent b="0" l="0" r="0" t="0"/>
+            <wp:docPr id="17" name="image17.png"/>
+            <a:graphic>
+              <a:graphicData uri="http://schemas.openxmlformats.org/drawingml/2006/picture">
+                <pic:pic>
+                  <pic:nvPicPr>
+                    <pic:cNvPr id="0" name="image17.png"/>
+                    <pic:cNvPicPr preferRelativeResize="0"/>
+                  </pic:nvPicPr>
+                  <pic:blipFill>
+                    <a:blip r:embed="rId16"/>
+                    <a:srcRect b="0" l="0" r="0" t="0"/>
+                    <a:stretch>
+                      <a:fillRect/>
+                    </a:stretch>
+                  </pic:blipFill>
+                  <pic:spPr>
+                    <a:xfrm>
+                      <a:off x="0" y="0"/>
+                      <a:ext cx="5338763" cy="4584951"/>
+                    </a:xfrm>
+                    <a:prstGeom prst="rect"/>
+                    <a:ln/>
+                  </pic:spPr>
+                </pic:pic>
+              </a:graphicData>
+            </a:graphic>
+          </wp:inline>
+        </w:drawing>
+      </w:r>
+      <w:r>
+        <w:rPr>
+          <w:rtl w:val="0"/>
+        </w:rPr>
+      </w:r>
+    </w:p>
+    <w:p>
+      <w:pPr>
+        <w:rPr>
+          <w:b w:val="1"/>
+          <w:bCs w:val="1"/>
+          <w:u w:val="single"/>
+        </w:rPr>
+      </w:pPr>
+      <w:r>
+        <w:rPr>
+          <w:rtl w:val="0"/>
+        </w:rPr>
+      </w:r>
+    </w:p>
+    <w:p>
+      <w:pPr>
         <w:rPr/>
       </w:pPr>
       <w:r>
@@ -1003,16 +4603,16 @@
           <wp:inline distB="114300" distT="114300" distL="114300" distR="114300">
             <wp:extent cx="5731200" cy="4127500"/>
             <wp:effectExtent b="0" l="0" r="0" t="0"/>
-            <wp:docPr id="6" name="image2.png"/>
+            <wp:docPr id="20" name="image18.png"/>
             <a:graphic>
               <a:graphicData uri="http://schemas.openxmlformats.org/drawingml/2006/picture">
                 <pic:pic>
                   <pic:nvPicPr>
-                    <pic:cNvPr id="0" name="image2.png"/>
+                    <pic:cNvPr id="0" name="image18.png"/>
                     <pic:cNvPicPr preferRelativeResize="0"/>
                   </pic:nvPicPr>
                   <pic:blipFill>
-                    <a:blip r:embed="rId10"/>
+                    <a:blip r:embed="rId17"/>
                     <a:srcRect b="0" l="0" r="0" t="0"/>
                     <a:stretch>
                       <a:fillRect/>
@@ -1117,18 +4717,18 @@
         <w:rPr/>
         <w:drawing>
           <wp:inline distB="114300" distT="114300" distL="114300" distR="114300">
-            <wp:extent cx="5731200" cy="4191000"/>
+            <wp:extent cx="5681663" cy="3505200"/>
             <wp:effectExtent b="0" l="0" r="0" t="0"/>
-            <wp:docPr id="1" name="image5.png"/>
+            <wp:docPr id="1" name="image6.png"/>
             <a:graphic>
               <a:graphicData uri="http://schemas.openxmlformats.org/drawingml/2006/picture">
                 <pic:pic>
                   <pic:nvPicPr>
-                    <pic:cNvPr id="0" name="image5.png"/>
+                    <pic:cNvPr id="0" name="image6.png"/>
                     <pic:cNvPicPr preferRelativeResize="0"/>
                   </pic:nvPicPr>
                   <pic:blipFill>
-                    <a:blip r:embed="rId11"/>
+                    <a:blip r:embed="rId18"/>
                     <a:srcRect b="0" l="0" r="0" t="0"/>
                     <a:stretch>
                       <a:fillRect/>
@@ -1137,7 +4737,7 @@
                   <pic:spPr>
                     <a:xfrm>
                       <a:off x="0" y="0"/>
-                      <a:ext cx="5731200" cy="4191000"/>
+                      <a:ext cx="5681663" cy="3505200"/>
                     </a:xfrm>
                     <a:prstGeom prst="rect"/>
                     <a:ln/>
@@ -1156,260 +4756,30 @@
     </w:p>
     <w:p>
       <w:pPr>
-        <w:rPr/>
-      </w:pPr>
-      <w:r>
-        <w:rPr>
-          <w:rtl w:val="0"/>
-        </w:rPr>
-      </w:r>
-    </w:p>
-    <w:p>
-      <w:pPr>
-        <w:rPr/>
-      </w:pPr>
-      <w:r>
-        <w:rPr>
-          <w:rtl w:val="0"/>
-        </w:rPr>
-      </w:r>
-    </w:p>
-    <w:p>
-      <w:pPr>
-        <w:rPr/>
-      </w:pPr>
-      <w:r>
-        <w:rPr>
-          <w:rtl w:val="0"/>
-        </w:rPr>
-      </w:r>
-    </w:p>
-    <w:p>
-      <w:pPr>
-        <w:rPr/>
-      </w:pPr>
-      <w:r>
-        <w:rPr>
-          <w:rtl w:val="0"/>
-        </w:rPr>
-      </w:r>
-    </w:p>
-    <w:p>
-      <w:pPr>
-        <w:rPr/>
-      </w:pPr>
-      <w:r>
-        <w:rPr>
-          <w:rtl w:val="0"/>
-        </w:rPr>
-      </w:r>
-    </w:p>
-    <w:p>
-      <w:pPr>
-        <w:rPr/>
-      </w:pPr>
-      <w:r>
-        <w:rPr>
-          <w:rtl w:val="0"/>
-        </w:rPr>
-      </w:r>
-    </w:p>
-    <w:p>
-      <w:pPr>
-        <w:rPr/>
-      </w:pPr>
-      <w:r>
-        <w:rPr>
-          <w:rtl w:val="0"/>
-        </w:rPr>
-      </w:r>
-    </w:p>
-    <w:p>
-      <w:pPr>
-        <w:rPr/>
-      </w:pPr>
-      <w:r>
-        <w:rPr>
-          <w:rtl w:val="0"/>
-        </w:rPr>
-      </w:r>
-    </w:p>
-    <w:p>
-      <w:pPr>
-        <w:rPr/>
-      </w:pPr>
-      <w:r>
-        <w:rPr>
-          <w:rtl w:val="0"/>
-        </w:rPr>
-      </w:r>
-    </w:p>
-    <w:p>
-      <w:pPr>
-        <w:rPr/>
-      </w:pPr>
-      <w:r>
-        <w:rPr>
-          <w:rtl w:val="0"/>
-        </w:rPr>
-      </w:r>
-    </w:p>
-    <w:p>
-      <w:pPr>
-        <w:rPr/>
-      </w:pPr>
-      <w:r>
-        <w:rPr>
-          <w:rtl w:val="0"/>
-        </w:rPr>
-      </w:r>
-    </w:p>
-    <w:p>
-      <w:pPr>
-        <w:rPr/>
-      </w:pPr>
-      <w:r>
-        <w:rPr>
-          <w:rtl w:val="0"/>
-        </w:rPr>
-      </w:r>
-    </w:p>
-    <w:p>
-      <w:pPr>
-        <w:rPr/>
-      </w:pPr>
-      <w:r>
-        <w:rPr>
-          <w:rtl w:val="0"/>
-        </w:rPr>
-      </w:r>
-    </w:p>
-    <w:p>
-      <w:pPr>
-        <w:rPr/>
-      </w:pPr>
-      <w:r>
-        <w:rPr>
-          <w:rtl w:val="0"/>
-        </w:rPr>
-      </w:r>
-    </w:p>
-    <w:p>
-      <w:pPr>
-        <w:rPr/>
-      </w:pPr>
-      <w:r>
-        <w:rPr>
-          <w:rtl w:val="0"/>
-        </w:rPr>
-      </w:r>
-    </w:p>
-    <w:p>
-      <w:pPr>
-        <w:rPr/>
-      </w:pPr>
-      <w:r>
-        <w:rPr>
-          <w:rtl w:val="0"/>
-        </w:rPr>
-      </w:r>
-    </w:p>
-    <w:p>
-      <w:pPr>
-        <w:rPr/>
-      </w:pPr>
-      <w:r>
-        <w:rPr>
-          <w:rtl w:val="0"/>
-        </w:rPr>
-      </w:r>
-    </w:p>
-    <w:p>
-      <w:pPr>
-        <w:rPr/>
-      </w:pPr>
-      <w:r>
-        <w:rPr>
-          <w:rtl w:val="0"/>
-        </w:rPr>
-      </w:r>
-    </w:p>
-    <w:p>
-      <w:pPr>
-        <w:rPr/>
-      </w:pPr>
-      <w:r>
-        <w:rPr>
-          <w:rtl w:val="0"/>
-        </w:rPr>
-      </w:r>
-    </w:p>
-    <w:p>
-      <w:pPr>
-        <w:rPr/>
-      </w:pPr>
-      <w:r>
-        <w:rPr>
-          <w:rtl w:val="0"/>
-        </w:rPr>
-      </w:r>
-    </w:p>
-    <w:p>
-      <w:pPr>
-        <w:rPr/>
-      </w:pPr>
-      <w:r>
-        <w:rPr>
-          <w:rtl w:val="0"/>
-        </w:rPr>
-      </w:r>
-    </w:p>
-    <w:p>
-      <w:pPr>
-        <w:rPr/>
-      </w:pPr>
-      <w:r>
-        <w:rPr>
-          <w:rtl w:val="0"/>
-        </w:rPr>
-      </w:r>
-    </w:p>
-    <w:p>
-      <w:pPr>
-        <w:rPr/>
-      </w:pPr>
-      <w:r>
-        <w:rPr>
-          <w:rtl w:val="0"/>
-        </w:rPr>
-      </w:r>
-    </w:p>
-    <w:p>
-      <w:pPr>
-        <w:rPr/>
-      </w:pPr>
-      <w:r>
-        <w:rPr>
-          <w:rtl w:val="0"/>
-        </w:rPr>
-      </w:r>
-    </w:p>
-    <w:p>
-      <w:pPr>
-        <w:rPr>
-          <w:b w:val="1"/>
-          <w:bCs w:val="1"/>
-          <w:u w:val="single"/>
-        </w:rPr>
-      </w:pPr>
-      <w:r>
-        <w:rPr>
-          <w:b w:val="1"/>
-          <w:bCs w:val="1"/>
-          <w:u w:val="single"/>
-          <w:rtl w:val="0"/>
-        </w:rPr>
-        <w:t xml:space="preserve">ARQUITECTURA GENERAL DEL SOFTWARE</w:t>
+        <w:rPr>
+          <w:b w:val="1"/>
+          <w:bCs w:val="1"/>
+          <w:u w:val="single"/>
+        </w:rPr>
+      </w:pPr>
+      <w:r>
+        <w:rPr>
+          <w:b w:val="1"/>
+          <w:bCs w:val="1"/>
+          <w:u w:val="single"/>
+          <w:rtl w:val="0"/>
+        </w:rPr>
+        <w:t xml:space="preserve">WIREFRAME FRONTEND</w:t>
+      </w:r>
+    </w:p>
+    <w:p>
+      <w:pPr>
+        <w:rPr/>
+      </w:pPr>
+      <w:r>
+        <w:rPr>
+          <w:rtl w:val="0"/>
+        </w:rPr>
       </w:r>
     </w:p>
     <w:p>
@@ -1420,9 +4790,9 @@
         <w:rPr/>
         <w:drawing>
           <wp:inline distB="114300" distT="114300" distL="114300" distR="114300">
-            <wp:extent cx="5731200" cy="2755900"/>
+            <wp:extent cx="4195763" cy="2592730"/>
             <wp:effectExtent b="0" l="0" r="0" t="0"/>
-            <wp:docPr id="5" name="image1.png"/>
+            <wp:docPr id="4" name="image1.png"/>
             <a:graphic>
               <a:graphicData uri="http://schemas.openxmlformats.org/drawingml/2006/picture">
                 <pic:pic>
@@ -1431,7 +4801,7 @@
                     <pic:cNvPicPr preferRelativeResize="0"/>
                   </pic:nvPicPr>
                   <pic:blipFill>
-                    <a:blip r:embed="rId12"/>
+                    <a:blip r:embed="rId19"/>
                     <a:srcRect b="0" l="0" r="0" t="0"/>
                     <a:stretch>
                       <a:fillRect/>
@@ -1440,7 +4810,7 @@
                   <pic:spPr>
                     <a:xfrm>
                       <a:off x="0" y="0"/>
-                      <a:ext cx="5731200" cy="2755900"/>
+                      <a:ext cx="4195763" cy="2592730"/>
                     </a:xfrm>
                     <a:prstGeom prst="rect"/>
                     <a:ln/>
@@ -1451,6 +4821,565 @@
           </wp:inline>
         </w:drawing>
       </w:r>
+      <w:r>
+        <w:rPr>
+          <w:rtl w:val="0"/>
+        </w:rPr>
+      </w:r>
+    </w:p>
+    <w:p>
+      <w:pPr>
+        <w:rPr/>
+      </w:pPr>
+      <w:r>
+        <w:rPr/>
+        <w:drawing>
+          <wp:inline distB="114300" distT="114300" distL="114300" distR="114300">
+            <wp:extent cx="4221363" cy="2629587"/>
+            <wp:effectExtent b="0" l="0" r="0" t="0"/>
+            <wp:docPr id="18" name="image4.png"/>
+            <a:graphic>
+              <a:graphicData uri="http://schemas.openxmlformats.org/drawingml/2006/picture">
+                <pic:pic>
+                  <pic:nvPicPr>
+                    <pic:cNvPr id="0" name="image4.png"/>
+                    <pic:cNvPicPr preferRelativeResize="0"/>
+                  </pic:nvPicPr>
+                  <pic:blipFill>
+                    <a:blip r:embed="rId20"/>
+                    <a:srcRect b="0" l="0" r="0" t="0"/>
+                    <a:stretch>
+                      <a:fillRect/>
+                    </a:stretch>
+                  </pic:blipFill>
+                  <pic:spPr>
+                    <a:xfrm>
+                      <a:off x="0" y="0"/>
+                      <a:ext cx="4221363" cy="2629587"/>
+                    </a:xfrm>
+                    <a:prstGeom prst="rect"/>
+                    <a:ln/>
+                  </pic:spPr>
+                </pic:pic>
+              </a:graphicData>
+            </a:graphic>
+          </wp:inline>
+        </w:drawing>
+      </w:r>
+      <w:r>
+        <w:rPr>
+          <w:rtl w:val="0"/>
+        </w:rPr>
+      </w:r>
+    </w:p>
+    <w:p>
+      <w:pPr>
+        <w:rPr/>
+      </w:pPr>
+      <w:r>
+        <w:rPr/>
+        <w:drawing>
+          <wp:inline distB="114300" distT="114300" distL="114300" distR="114300">
+            <wp:extent cx="4451771" cy="2775911"/>
+            <wp:effectExtent b="0" l="0" r="0" t="0"/>
+            <wp:docPr id="9" name="image3.png"/>
+            <a:graphic>
+              <a:graphicData uri="http://schemas.openxmlformats.org/drawingml/2006/picture">
+                <pic:pic>
+                  <pic:nvPicPr>
+                    <pic:cNvPr id="0" name="image3.png"/>
+                    <pic:cNvPicPr preferRelativeResize="0"/>
+                  </pic:nvPicPr>
+                  <pic:blipFill>
+                    <a:blip r:embed="rId21"/>
+                    <a:srcRect b="0" l="0" r="0" t="0"/>
+                    <a:stretch>
+                      <a:fillRect/>
+                    </a:stretch>
+                  </pic:blipFill>
+                  <pic:spPr>
+                    <a:xfrm>
+                      <a:off x="0" y="0"/>
+                      <a:ext cx="4451771" cy="2775911"/>
+                    </a:xfrm>
+                    <a:prstGeom prst="rect"/>
+                    <a:ln/>
+                  </pic:spPr>
+                </pic:pic>
+              </a:graphicData>
+            </a:graphic>
+          </wp:inline>
+        </w:drawing>
+      </w:r>
+      <w:r>
+        <w:rPr>
+          <w:rtl w:val="0"/>
+        </w:rPr>
+      </w:r>
+    </w:p>
+    <w:p>
+      <w:pPr>
+        <w:rPr/>
+      </w:pPr>
+      <w:r>
+        <w:rPr>
+          <w:rtl w:val="0"/>
+        </w:rPr>
+      </w:r>
+    </w:p>
+    <w:p>
+      <w:pPr>
+        <w:rPr/>
+      </w:pPr>
+      <w:r>
+        <w:rPr/>
+        <w:drawing>
+          <wp:inline distB="114300" distT="114300" distL="114300" distR="114300">
+            <wp:extent cx="4491577" cy="2795588"/>
+            <wp:effectExtent b="0" l="0" r="0" t="0"/>
+            <wp:docPr id="5" name="image2.png"/>
+            <a:graphic>
+              <a:graphicData uri="http://schemas.openxmlformats.org/drawingml/2006/picture">
+                <pic:pic>
+                  <pic:nvPicPr>
+                    <pic:cNvPr id="0" name="image2.png"/>
+                    <pic:cNvPicPr preferRelativeResize="0"/>
+                  </pic:nvPicPr>
+                  <pic:blipFill>
+                    <a:blip r:embed="rId22"/>
+                    <a:srcRect b="0" l="0" r="0" t="0"/>
+                    <a:stretch>
+                      <a:fillRect/>
+                    </a:stretch>
+                  </pic:blipFill>
+                  <pic:spPr>
+                    <a:xfrm>
+                      <a:off x="0" y="0"/>
+                      <a:ext cx="4491577" cy="2795588"/>
+                    </a:xfrm>
+                    <a:prstGeom prst="rect"/>
+                    <a:ln/>
+                  </pic:spPr>
+                </pic:pic>
+              </a:graphicData>
+            </a:graphic>
+          </wp:inline>
+        </w:drawing>
+      </w:r>
+      <w:r>
+        <w:rPr>
+          <w:rtl w:val="0"/>
+        </w:rPr>
+      </w:r>
+    </w:p>
+    <w:p>
+      <w:pPr>
+        <w:rPr/>
+      </w:pPr>
+      <w:r>
+        <w:rPr/>
+        <w:drawing>
+          <wp:inline distB="114300" distT="114300" distL="114300" distR="114300">
+            <wp:extent cx="4495688" cy="2779987"/>
+            <wp:effectExtent b="0" l="0" r="0" t="0"/>
+            <wp:docPr id="12" name="image5.png"/>
+            <a:graphic>
+              <a:graphicData uri="http://schemas.openxmlformats.org/drawingml/2006/picture">
+                <pic:pic>
+                  <pic:nvPicPr>
+                    <pic:cNvPr id="0" name="image5.png"/>
+                    <pic:cNvPicPr preferRelativeResize="0"/>
+                  </pic:nvPicPr>
+                  <pic:blipFill>
+                    <a:blip r:embed="rId23"/>
+                    <a:srcRect b="0" l="0" r="0" t="0"/>
+                    <a:stretch>
+                      <a:fillRect/>
+                    </a:stretch>
+                  </pic:blipFill>
+                  <pic:spPr>
+                    <a:xfrm>
+                      <a:off x="0" y="0"/>
+                      <a:ext cx="4495688" cy="2779987"/>
+                    </a:xfrm>
+                    <a:prstGeom prst="rect"/>
+                    <a:ln/>
+                  </pic:spPr>
+                </pic:pic>
+              </a:graphicData>
+            </a:graphic>
+          </wp:inline>
+        </w:drawing>
+      </w:r>
+      <w:r>
+        <w:rPr>
+          <w:rtl w:val="0"/>
+        </w:rPr>
+      </w:r>
+    </w:p>
+    <w:p>
+      <w:pPr>
+        <w:rPr/>
+      </w:pPr>
+      <w:r>
+        <w:rPr>
+          <w:rtl w:val="0"/>
+        </w:rPr>
+      </w:r>
+    </w:p>
+    <w:p>
+      <w:pPr>
+        <w:rPr/>
+      </w:pPr>
+      <w:r>
+        <w:rPr/>
+        <w:drawing>
+          <wp:inline distB="114300" distT="114300" distL="114300" distR="114300">
+            <wp:extent cx="4481513" cy="2808899"/>
+            <wp:effectExtent b="0" l="0" r="0" t="0"/>
+            <wp:docPr id="8" name="image16.png"/>
+            <a:graphic>
+              <a:graphicData uri="http://schemas.openxmlformats.org/drawingml/2006/picture">
+                <pic:pic>
+                  <pic:nvPicPr>
+                    <pic:cNvPr id="0" name="image16.png"/>
+                    <pic:cNvPicPr preferRelativeResize="0"/>
+                  </pic:nvPicPr>
+                  <pic:blipFill>
+                    <a:blip r:embed="rId24"/>
+                    <a:srcRect b="0" l="0" r="0" t="0"/>
+                    <a:stretch>
+                      <a:fillRect/>
+                    </a:stretch>
+                  </pic:blipFill>
+                  <pic:spPr>
+                    <a:xfrm>
+                      <a:off x="0" y="0"/>
+                      <a:ext cx="4481513" cy="2808899"/>
+                    </a:xfrm>
+                    <a:prstGeom prst="rect"/>
+                    <a:ln/>
+                  </pic:spPr>
+                </pic:pic>
+              </a:graphicData>
+            </a:graphic>
+          </wp:inline>
+        </w:drawing>
+      </w:r>
+      <w:r>
+        <w:rPr>
+          <w:rtl w:val="0"/>
+        </w:rPr>
+      </w:r>
+    </w:p>
+    <w:p>
+      <w:pPr>
+        <w:rPr/>
+      </w:pPr>
+      <w:r>
+        <w:rPr/>
+        <w:drawing>
+          <wp:inline distB="114300" distT="114300" distL="114300" distR="114300">
+            <wp:extent cx="4348163" cy="2708389"/>
+            <wp:effectExtent b="0" l="0" r="0" t="0"/>
+            <wp:docPr id="13" name="image9.png"/>
+            <a:graphic>
+              <a:graphicData uri="http://schemas.openxmlformats.org/drawingml/2006/picture">
+                <pic:pic>
+                  <pic:nvPicPr>
+                    <pic:cNvPr id="0" name="image9.png"/>
+                    <pic:cNvPicPr preferRelativeResize="0"/>
+                  </pic:nvPicPr>
+                  <pic:blipFill>
+                    <a:blip r:embed="rId25"/>
+                    <a:srcRect b="0" l="0" r="0" t="0"/>
+                    <a:stretch>
+                      <a:fillRect/>
+                    </a:stretch>
+                  </pic:blipFill>
+                  <pic:spPr>
+                    <a:xfrm>
+                      <a:off x="0" y="0"/>
+                      <a:ext cx="4348163" cy="2708389"/>
+                    </a:xfrm>
+                    <a:prstGeom prst="rect"/>
+                    <a:ln/>
+                  </pic:spPr>
+                </pic:pic>
+              </a:graphicData>
+            </a:graphic>
+          </wp:inline>
+        </w:drawing>
+      </w:r>
+      <w:r>
+        <w:rPr>
+          <w:rtl w:val="0"/>
+        </w:rPr>
+      </w:r>
+    </w:p>
+    <w:p>
+      <w:pPr>
+        <w:rPr/>
+      </w:pPr>
+      <w:r>
+        <w:rPr>
+          <w:rtl w:val="0"/>
+        </w:rPr>
+      </w:r>
+    </w:p>
+    <w:p>
+      <w:pPr>
+        <w:rPr/>
+      </w:pPr>
+      <w:r>
+        <w:rPr/>
+        <w:drawing>
+          <wp:inline distB="114300" distT="114300" distL="114300" distR="114300">
+            <wp:extent cx="4462463" cy="2783336"/>
+            <wp:effectExtent b="0" l="0" r="0" t="0"/>
+            <wp:docPr id="7" name="image10.png"/>
+            <a:graphic>
+              <a:graphicData uri="http://schemas.openxmlformats.org/drawingml/2006/picture">
+                <pic:pic>
+                  <pic:nvPicPr>
+                    <pic:cNvPr id="0" name="image10.png"/>
+                    <pic:cNvPicPr preferRelativeResize="0"/>
+                  </pic:nvPicPr>
+                  <pic:blipFill>
+                    <a:blip r:embed="rId26"/>
+                    <a:srcRect b="0" l="0" r="0" t="0"/>
+                    <a:stretch>
+                      <a:fillRect/>
+                    </a:stretch>
+                  </pic:blipFill>
+                  <pic:spPr>
+                    <a:xfrm>
+                      <a:off x="0" y="0"/>
+                      <a:ext cx="4462463" cy="2783336"/>
+                    </a:xfrm>
+                    <a:prstGeom prst="rect"/>
+                    <a:ln/>
+                  </pic:spPr>
+                </pic:pic>
+              </a:graphicData>
+            </a:graphic>
+          </wp:inline>
+        </w:drawing>
+      </w:r>
+      <w:r>
+        <w:rPr>
+          <w:rtl w:val="0"/>
+        </w:rPr>
+      </w:r>
+    </w:p>
+    <w:p>
+      <w:pPr>
+        <w:rPr/>
+      </w:pPr>
+      <w:r>
+        <w:rPr>
+          <w:rtl w:val="0"/>
+        </w:rPr>
+      </w:r>
+    </w:p>
+    <w:p>
+      <w:pPr>
+        <w:rPr/>
+      </w:pPr>
+      <w:r>
+        <w:rPr/>
+        <w:drawing>
+          <wp:inline distB="114300" distT="114300" distL="114300" distR="114300">
+            <wp:extent cx="4414838" cy="2755929"/>
+            <wp:effectExtent b="0" l="0" r="0" t="0"/>
+            <wp:docPr id="16" name="image11.png"/>
+            <a:graphic>
+              <a:graphicData uri="http://schemas.openxmlformats.org/drawingml/2006/picture">
+                <pic:pic>
+                  <pic:nvPicPr>
+                    <pic:cNvPr id="0" name="image11.png"/>
+                    <pic:cNvPicPr preferRelativeResize="0"/>
+                  </pic:nvPicPr>
+                  <pic:blipFill>
+                    <a:blip r:embed="rId27"/>
+                    <a:srcRect b="0" l="0" r="0" t="0"/>
+                    <a:stretch>
+                      <a:fillRect/>
+                    </a:stretch>
+                  </pic:blipFill>
+                  <pic:spPr>
+                    <a:xfrm>
+                      <a:off x="0" y="0"/>
+                      <a:ext cx="4414838" cy="2755929"/>
+                    </a:xfrm>
+                    <a:prstGeom prst="rect"/>
+                    <a:ln/>
+                  </pic:spPr>
+                </pic:pic>
+              </a:graphicData>
+            </a:graphic>
+          </wp:inline>
+        </w:drawing>
+      </w:r>
+      <w:r>
+        <w:rPr>
+          <w:rtl w:val="0"/>
+        </w:rPr>
+      </w:r>
+    </w:p>
+    <w:p>
+      <w:pPr>
+        <w:rPr/>
+      </w:pPr>
+      <w:r>
+        <w:rPr/>
+        <w:drawing>
+          <wp:inline distB="114300" distT="114300" distL="114300" distR="114300">
+            <wp:extent cx="4902918" cy="3062288"/>
+            <wp:effectExtent b="0" l="0" r="0" t="0"/>
+            <wp:docPr id="15" name="image7.png"/>
+            <a:graphic>
+              <a:graphicData uri="http://schemas.openxmlformats.org/drawingml/2006/picture">
+                <pic:pic>
+                  <pic:nvPicPr>
+                    <pic:cNvPr id="0" name="image7.png"/>
+                    <pic:cNvPicPr preferRelativeResize="0"/>
+                  </pic:nvPicPr>
+                  <pic:blipFill>
+                    <a:blip r:embed="rId28"/>
+                    <a:srcRect b="0" l="0" r="0" t="0"/>
+                    <a:stretch>
+                      <a:fillRect/>
+                    </a:stretch>
+                  </pic:blipFill>
+                  <pic:spPr>
+                    <a:xfrm>
+                      <a:off x="0" y="0"/>
+                      <a:ext cx="4902918" cy="3062288"/>
+                    </a:xfrm>
+                    <a:prstGeom prst="rect"/>
+                    <a:ln/>
+                  </pic:spPr>
+                </pic:pic>
+              </a:graphicData>
+            </a:graphic>
+          </wp:inline>
+        </w:drawing>
+      </w:r>
+      <w:r>
+        <w:rPr>
+          <w:rtl w:val="0"/>
+        </w:rPr>
+      </w:r>
+    </w:p>
+    <w:p>
+      <w:pPr>
+        <w:rPr/>
+      </w:pPr>
+      <w:r>
+        <w:rPr>
+          <w:rtl w:val="0"/>
+        </w:rPr>
+      </w:r>
+    </w:p>
+    <w:p>
+      <w:pPr>
+        <w:rPr/>
+      </w:pPr>
+      <w:r>
+        <w:rPr>
+          <w:rtl w:val="0"/>
+        </w:rPr>
+      </w:r>
+    </w:p>
+    <w:p>
+      <w:pPr>
+        <w:rPr/>
+      </w:pPr>
+      <w:r>
+        <w:rPr>
+          <w:rtl w:val="0"/>
+        </w:rPr>
+      </w:r>
+    </w:p>
+    <w:p>
+      <w:pPr>
+        <w:rPr/>
+      </w:pPr>
+      <w:r>
+        <w:rPr>
+          <w:rtl w:val="0"/>
+        </w:rPr>
+      </w:r>
+    </w:p>
+    <w:p>
+      <w:pPr>
+        <w:rPr/>
+      </w:pPr>
+      <w:r>
+        <w:rPr>
+          <w:rtl w:val="0"/>
+        </w:rPr>
+      </w:r>
+    </w:p>
+    <w:p>
+      <w:pPr>
+        <w:rPr/>
+      </w:pPr>
+      <w:r>
+        <w:rPr>
+          <w:rtl w:val="0"/>
+        </w:rPr>
+      </w:r>
+    </w:p>
+    <w:p>
+      <w:pPr>
+        <w:rPr/>
+      </w:pPr>
+      <w:r>
+        <w:rPr>
+          <w:rtl w:val="0"/>
+        </w:rPr>
+      </w:r>
+    </w:p>
+    <w:p>
+      <w:pPr>
+        <w:rPr/>
+      </w:pPr>
+      <w:r>
+        <w:rPr>
+          <w:rtl w:val="0"/>
+        </w:rPr>
+      </w:r>
+    </w:p>
+    <w:p>
+      <w:pPr>
+        <w:rPr/>
+      </w:pPr>
+      <w:r>
+        <w:rPr>
+          <w:rtl w:val="0"/>
+        </w:rPr>
+      </w:r>
+    </w:p>
+    <w:p>
+      <w:pPr>
+        <w:rPr>
+          <w:b w:val="1"/>
+          <w:bCs w:val="1"/>
+          <w:u w:val="single"/>
+        </w:rPr>
+      </w:pPr>
+      <w:r>
+        <w:rPr>
+          <w:rtl w:val="0"/>
+        </w:rPr>
+      </w:r>
+    </w:p>
+    <w:p>
+      <w:pPr>
+        <w:rPr/>
+      </w:pPr>
       <w:r>
         <w:rPr>
           <w:rtl w:val="0"/>

</xml_diff>